<commit_message>
docs: complete TaxLens v1 specification suite
</commit_message>
<xml_diff>
--- a/README.docx
+++ b/README.docx
@@ -1,32 +1,29 @@
 
 <file path=word/document.xml><?xml version="1.0" encoding="utf-8"?>
-<w:document xmlns:w="http://schemas.openxmlformats.org/wordprocessingml/2006/main" xmlns:m="http://schemas.openxmlformats.org/officeDocument/2006/math" xmlns:r="http://schemas.openxmlformats.org/officeDocument/2006/relationships" xmlns:o="urn:schemas-microsoft-com:office:office" xmlns:v="urn:schemas-microsoft-com:vml" xmlns:w10="urn:schemas-microsoft-com:office:word" xmlns:a="http://schemas.openxmlformats.org/drawingml/2006/main" xmlns:pic="http://schemas.openxmlformats.org/drawingml/2006/picture" xmlns:wp="http://schemas.openxmlformats.org/drawingml/2006/wordprocessingDrawing">
+<w:document xmlns:wpc="http://schemas.microsoft.com/office/word/2010/wordprocessingCanvas" xmlns:cx="http://schemas.microsoft.com/office/drawing/2014/chartex" xmlns:cx1="http://schemas.microsoft.com/office/drawing/2015/9/8/chartex" xmlns:cx2="http://schemas.microsoft.com/office/drawing/2015/10/21/chartex" xmlns:cx3="http://schemas.microsoft.com/office/drawing/2016/5/9/chartex" xmlns:cx4="http://schemas.microsoft.com/office/drawing/2016/5/10/chartex" xmlns:cx5="http://schemas.microsoft.com/office/drawing/2016/5/11/chartex" xmlns:cx6="http://schemas.microsoft.com/office/drawing/2016/5/12/chartex" xmlns:cx7="http://schemas.microsoft.com/office/drawing/2016/5/13/chartex" xmlns:cx8="http://schemas.microsoft.com/office/drawing/2016/5/14/chartex" xmlns:mc="http://schemas.openxmlformats.org/markup-compatibility/2006" xmlns:aink="http://schemas.microsoft.com/office/drawing/2016/ink" xmlns:am3d="http://schemas.microsoft.com/office/drawing/2017/model3d" xmlns:o="urn:schemas-microsoft-com:office:office" xmlns:oel="http://schemas.microsoft.com/office/2019/extlst" xmlns:r="http://schemas.openxmlformats.org/officeDocument/2006/relationships" xmlns:m="http://schemas.openxmlformats.org/officeDocument/2006/math" xmlns:v="urn:schemas-microsoft-com:vml" xmlns:wp14="http://schemas.microsoft.com/office/word/2010/wordprocessingDrawing" xmlns:wp="http://schemas.openxmlformats.org/drawingml/2006/wordprocessingDrawing" xmlns:w10="urn:schemas-microsoft-com:office:word" xmlns:w="http://schemas.openxmlformats.org/wordprocessingml/2006/main" xmlns:w14="http://schemas.microsoft.com/office/word/2010/wordml" xmlns:w15="http://schemas.microsoft.com/office/word/2012/wordml" xmlns:w16cex="http://schemas.microsoft.com/office/word/2018/wordml/cex" xmlns:w16cid="http://schemas.microsoft.com/office/word/2016/wordml/cid" xmlns:w16="http://schemas.microsoft.com/office/word/2018/wordml" xmlns:w16du="http://schemas.microsoft.com/office/word/2023/wordml/word16du" xmlns:w16sdtdh="http://schemas.microsoft.com/office/word/2020/wordml/sdtdatahash" xmlns:w16sdtfl="http://schemas.microsoft.com/office/word/2024/wordml/sdtformatlock" xmlns:w16se="http://schemas.microsoft.com/office/word/2015/wordml/symex" xmlns:wpg="http://schemas.microsoft.com/office/word/2010/wordprocessingGroup" xmlns:wpi="http://schemas.microsoft.com/office/word/2010/wordprocessingInk" xmlns:wne="http://schemas.microsoft.com/office/word/2006/wordml" xmlns:wps="http://schemas.microsoft.com/office/word/2010/wordprocessingShape" mc:Ignorable="w14 w15 w16se w16cid w16 w16cex w16sdtdh w16sdtfl w16du wp14">
   <w:body>
-    <w:bookmarkStart w:id="32" w:name="taxlens"/>
-    <w:p>
-      <w:pPr>
-        <w:pStyle w:val="1"/>
-      </w:pPr>
-      <w:r>
-        <w:t xml:space="preserve">TaxLens</w:t>
-      </w:r>
-    </w:p>
-    <w:p>
-      <w:pPr>
-        <w:pStyle w:val="aa"/>
+    <w:p>
+      <w:pPr>
+        <w:pStyle w:val="Heading1"/>
+      </w:pPr>
+      <w:bookmarkStart w:id="0" w:name="taxlens"/>
+      <w:r>
+        <w:t>TaxLens</w:t>
+      </w:r>
+    </w:p>
+    <w:p>
+      <w:pPr>
+        <w:pStyle w:val="BlockText"/>
       </w:pPr>
       <w:r>
         <w:rPr>
           <w:b/>
           <w:bCs/>
         </w:rPr>
-        <w:t xml:space="preserve">Status:</w:t>
-      </w:r>
-      <w:r>
-        <w:t xml:space="preserve"> </w:t>
-      </w:r>
-      <w:r>
-        <w:t xml:space="preserve">Specification &amp; Architecture Complete | Implementation Backlog Defined</w:t>
+        <w:t>Status:</w:t>
+      </w:r>
+      <w:r>
+        <w:t xml:space="preserve"> Specification &amp; Architecture Complete | Implementation Backlog Defined</w:t>
       </w:r>
       <w:r>
         <w:br/>
@@ -36,13 +33,10 @@
           <w:b/>
           <w:bCs/>
         </w:rPr>
-        <w:t xml:space="preserve">Scope:</w:t>
-      </w:r>
-      <w:r>
-        <w:t xml:space="preserve"> </w:t>
-      </w:r>
-      <w:r>
-        <w:t xml:space="preserve">India income-tax filing-support SaaS for salaried ITR-1 filers (AY 2025-26)</w:t>
+        <w:t>Scope:</w:t>
+      </w:r>
+      <w:r>
+        <w:t xml:space="preserve"> India income-tax filing-support SaaS for salaried ITR-1 filers (AY 2025-26)</w:t>
       </w:r>
       <w:r>
         <w:br/>
@@ -52,40 +46,37 @@
           <w:b/>
           <w:bCs/>
         </w:rPr>
-        <w:t xml:space="preserve">Author:</w:t>
+        <w:t>Author:</w:t>
       </w:r>
       <w:r>
         <w:t xml:space="preserve"> </w:t>
       </w:r>
-      <w:hyperlink r:id="rId20">
+      <w:hyperlink r:id="rId7">
         <w:r>
           <w:rPr>
-            <w:rStyle w:val="af"/>
+            <w:rStyle w:val="Hyperlink"/>
           </w:rPr>
-          <w:t xml:space="preserve">Sahil Zafar</w:t>
+          <w:t>Sahil Zafar</w:t>
         </w:r>
       </w:hyperlink>
       <w:r>
-        <w:t xml:space="preserve"> </w:t>
-      </w:r>
-      <w:r>
-        <w:t xml:space="preserve">— BCom (Hons) Accounting | Data Analytics &amp; Full-Stack Development</w:t>
-      </w:r>
-    </w:p>
-    <w:p>
-      <w:r>
-        <w:pict>
-          <v:rect style="width:0;height:1.5pt" o:hralign="center" o:hrstd="t" o:hr="t"/>
+        <w:t xml:space="preserve"> — BCom (Hons) Accounting | Data Analytics &amp; Full-Stack Development</w:t>
+      </w:r>
+    </w:p>
+    <w:p>
+      <w:r>
+        <w:pict w14:anchorId="070A1D0A">
+          <v:rect id="_x0000_i1025" style="width:0;height:1.5pt" o:hralign="center" o:hrstd="t" o:hr="t"/>
         </w:pict>
       </w:r>
     </w:p>
-    <w:bookmarkStart w:id="21" w:name="what-this-is"/>
-    <w:p>
-      <w:pPr>
-        <w:pStyle w:val="2"/>
-      </w:pPr>
-      <w:r>
-        <w:t xml:space="preserve">What This Is</w:t>
+    <w:p>
+      <w:pPr>
+        <w:pStyle w:val="Heading2"/>
+      </w:pPr>
+      <w:bookmarkStart w:id="1" w:name="what-this-is"/>
+      <w:r>
+        <w:t>What This Is</w:t>
       </w:r>
     </w:p>
     <w:p>
@@ -93,381 +84,399 @@
         <w:pStyle w:val="FirstParagraph"/>
       </w:pPr>
       <w:r>
-        <w:t xml:space="preserve">TaxLens is a full product specification for a regulated fintech SaaS that helps Indian salaried individuals upload tax documents (Form 16, AIS, 26AS), extract structured data via OCR, compute old-vs-new regime tax estimates, and generate CA-ready PDF reports.</w:t>
-      </w:r>
-    </w:p>
-    <w:p>
-      <w:pPr>
-        <w:pStyle w:val="a0"/>
-      </w:pPr>
-      <w:r>
-        <w:t xml:space="preserve">This repository contains the complete design-phase output: PRD, system architecture, database schema, API contracts, Temporal workflows, compliance controls (DPDP Act 2023 / IT Act 2000), frontend screen specs, admin console design, and an 83-chunk delivery backlog.</w:t>
-      </w:r>
-    </w:p>
-    <w:p>
-      <w:r>
-        <w:pict>
-          <v:rect style="width:0;height:1.5pt" o:hralign="center" o:hrstd="t" o:hr="t"/>
+        <w:t>TaxLens is a full product specification for a regulated fintech SaaS that helps Indian salaried individuals upload tax documents (Form 16, AIS, 26AS), extract structured data via OCR, compute old-vs-new regime tax estimates, and generate CA-ready PDF reports.</w:t>
+      </w:r>
+    </w:p>
+    <w:p>
+      <w:pPr>
+        <w:pStyle w:val="BodyText"/>
+      </w:pPr>
+      <w:r>
+        <w:t>This repository contains the complete design-phase output: PRD, system architecture, database schema, API contracts, Temporal workflows, compliance controls (DPDP Act 2023 / IT Act 2000), frontend screen specs, admin console design, and an 83-chunk delivery backlog.</w:t>
+      </w:r>
+    </w:p>
+    <w:p>
+      <w:r>
+        <w:pict w14:anchorId="2A08C9F9">
+          <v:rect id="_x0000_i1026" style="width:0;height:1.5pt" o:hralign="center" o:hrstd="t" o:hr="t"/>
         </w:pict>
       </w:r>
     </w:p>
-    <w:bookmarkEnd w:id="21"/>
-    <w:bookmarkStart w:id="22" w:name="repository-structure"/>
-    <w:p>
-      <w:pPr>
-        <w:pStyle w:val="2"/>
-      </w:pPr>
-      <w:r>
-        <w:t xml:space="preserve">Repository Structure</w:t>
+    <w:p>
+      <w:pPr>
+        <w:pStyle w:val="Heading2"/>
+      </w:pPr>
+      <w:bookmarkStart w:id="2" w:name="repository-structure"/>
+      <w:bookmarkEnd w:id="1"/>
+      <w:r>
+        <w:t>Repository Structure</w:t>
       </w:r>
     </w:p>
     <w:tbl>
       <w:tblPr>
         <w:tblStyle w:val="Table"/>
-        <w:tblW w:type="pct" w:w="5000"/>
-        <w:jc w:val="left"/>
+        <w:tblW w:w="5000" w:type="pct"/>
         <w:tblLayout w:type="fixed"/>
-        <w:tblLook w:firstRow="1" w:lastRow="0" w:firstColumn="0" w:lastColumn="0" w:noHBand="0" w:noVBand="0" w:val="0020"/>
+        <w:tblLook w:val="0020" w:firstRow="1" w:lastRow="0" w:firstColumn="0" w:lastColumn="0" w:noHBand="0" w:noVBand="0"/>
       </w:tblPr>
       <w:tblGrid>
-        <w:gridCol w:w="3520"/>
-        <w:gridCol w:w="4400"/>
+        <w:gridCol w:w="3936"/>
+        <w:gridCol w:w="4920"/>
       </w:tblGrid>
       <w:tr>
         <w:trPr>
-          <w:tblHeader w:val="on"/>
+          <w:cnfStyle w:val="100000000000" w:firstRow="1" w:lastRow="0" w:firstColumn="0" w:lastColumn="0" w:oddVBand="0" w:evenVBand="0" w:oddHBand="0" w:evenHBand="0" w:firstRowFirstColumn="0" w:firstRowLastColumn="0" w:lastRowFirstColumn="0" w:lastRowLastColumn="0"/>
+          <w:tblHeader/>
         </w:trPr>
         <w:tc>
-          <w:tcPr/>
-          <w:p>
-            <w:pPr>
-              <w:pStyle w:val="Compact"/>
-              <w:jc w:val="left"/>
-            </w:pPr>
-            <w:r>
-              <w:t xml:space="preserve">Folder</w:t>
-            </w:r>
-          </w:p>
-        </w:tc>
-        <w:tc>
-          <w:tcPr/>
-          <w:p>
-            <w:pPr>
-              <w:pStyle w:val="Compact"/>
-              <w:jc w:val="left"/>
-            </w:pPr>
-            <w:r>
-              <w:t xml:space="preserve">Contents</w:t>
+          <w:tcPr>
+            <w:tcW w:w="3520" w:type="dxa"/>
+          </w:tcPr>
+          <w:p>
+            <w:pPr>
+              <w:pStyle w:val="Compact"/>
+            </w:pPr>
+            <w:r>
+              <w:t>Folder</w:t>
+            </w:r>
+          </w:p>
+        </w:tc>
+        <w:tc>
+          <w:tcPr>
+            <w:tcW w:w="4400" w:type="dxa"/>
+          </w:tcPr>
+          <w:p>
+            <w:pPr>
+              <w:pStyle w:val="Compact"/>
+            </w:pPr>
+            <w:r>
+              <w:t>Contents</w:t>
             </w:r>
           </w:p>
         </w:tc>
       </w:tr>
       <w:tr>
         <w:tc>
-          <w:tcPr/>
-          <w:p>
-            <w:pPr>
-              <w:pStyle w:val="Compact"/>
-              <w:jc w:val="left"/>
+          <w:tcPr>
+            <w:tcW w:w="3520" w:type="dxa"/>
+          </w:tcPr>
+          <w:p>
+            <w:pPr>
+              <w:pStyle w:val="Compact"/>
             </w:pPr>
             <w:r>
               <w:rPr>
                 <w:rStyle w:val="VerbatimChar"/>
               </w:rPr>
-              <w:t xml:space="preserve">docs/01_product/</w:t>
-            </w:r>
-          </w:p>
-        </w:tc>
-        <w:tc>
-          <w:tcPr/>
-          <w:p>
-            <w:pPr>
-              <w:pStyle w:val="Compact"/>
-              <w:jc w:val="left"/>
-            </w:pPr>
-            <w:r>
-              <w:t xml:space="preserve">Scope clarification, MVP definition, Product Requirements Document</w:t>
+              <w:t>docs/01_product/</w:t>
+            </w:r>
+          </w:p>
+        </w:tc>
+        <w:tc>
+          <w:tcPr>
+            <w:tcW w:w="4400" w:type="dxa"/>
+          </w:tcPr>
+          <w:p>
+            <w:pPr>
+              <w:pStyle w:val="Compact"/>
+            </w:pPr>
+            <w:r>
+              <w:t>Scope clarification, MVP definition, Product Requirements Document</w:t>
             </w:r>
           </w:p>
         </w:tc>
       </w:tr>
       <w:tr>
         <w:tc>
-          <w:tcPr/>
-          <w:p>
-            <w:pPr>
-              <w:pStyle w:val="Compact"/>
-              <w:jc w:val="left"/>
+          <w:tcPr>
+            <w:tcW w:w="3520" w:type="dxa"/>
+          </w:tcPr>
+          <w:p>
+            <w:pPr>
+              <w:pStyle w:val="Compact"/>
             </w:pPr>
             <w:r>
               <w:rPr>
                 <w:rStyle w:val="VerbatimChar"/>
               </w:rPr>
-              <w:t xml:space="preserve">docs/02_architecture/</w:t>
-            </w:r>
-          </w:p>
-        </w:tc>
-        <w:tc>
-          <w:tcPr/>
-          <w:p>
-            <w:pPr>
-              <w:pStyle w:val="Compact"/>
-              <w:jc w:val="left"/>
-            </w:pPr>
-            <w:r>
-              <w:t xml:space="preserve">System architecture &amp; stitching reports (consistency checks across artifacts)</w:t>
+              <w:t>docs/02_architecture/</w:t>
+            </w:r>
+          </w:p>
+        </w:tc>
+        <w:tc>
+          <w:tcPr>
+            <w:tcW w:w="4400" w:type="dxa"/>
+          </w:tcPr>
+          <w:p>
+            <w:pPr>
+              <w:pStyle w:val="Compact"/>
+            </w:pPr>
+            <w:r>
+              <w:t>System architecture &amp; stitching reports (consistency checks across artifacts)</w:t>
             </w:r>
           </w:p>
         </w:tc>
       </w:tr>
       <w:tr>
         <w:tc>
-          <w:tcPr/>
-          <w:p>
-            <w:pPr>
-              <w:pStyle w:val="Compact"/>
-              <w:jc w:val="left"/>
+          <w:tcPr>
+            <w:tcW w:w="3520" w:type="dxa"/>
+          </w:tcPr>
+          <w:p>
+            <w:pPr>
+              <w:pStyle w:val="Compact"/>
             </w:pPr>
             <w:r>
               <w:rPr>
                 <w:rStyle w:val="VerbatimChar"/>
               </w:rPr>
-              <w:t xml:space="preserve">docs/03_data/</w:t>
-            </w:r>
-          </w:p>
-        </w:tc>
-        <w:tc>
-          <w:tcPr/>
-          <w:p>
-            <w:pPr>
-              <w:pStyle w:val="Compact"/>
-              <w:jc w:val="left"/>
-            </w:pPr>
-            <w:r>
-              <w:t xml:space="preserve">PostgreSQL schema design (15+ tables, field-level encryption, partitioning)</w:t>
+              <w:t>docs/03_data/</w:t>
+            </w:r>
+          </w:p>
+        </w:tc>
+        <w:tc>
+          <w:tcPr>
+            <w:tcW w:w="4400" w:type="dxa"/>
+          </w:tcPr>
+          <w:p>
+            <w:pPr>
+              <w:pStyle w:val="Compact"/>
+            </w:pPr>
+            <w:r>
+              <w:t>PostgreSQL schema design (15+ tables, field-level encryption, partitioning)</w:t>
             </w:r>
           </w:p>
         </w:tc>
       </w:tr>
       <w:tr>
         <w:tc>
-          <w:tcPr/>
-          <w:p>
-            <w:pPr>
-              <w:pStyle w:val="Compact"/>
-              <w:jc w:val="left"/>
+          <w:tcPr>
+            <w:tcW w:w="3520" w:type="dxa"/>
+          </w:tcPr>
+          <w:p>
+            <w:pPr>
+              <w:pStyle w:val="Compact"/>
             </w:pPr>
             <w:r>
               <w:rPr>
                 <w:rStyle w:val="VerbatimChar"/>
               </w:rPr>
-              <w:t xml:space="preserve">docs/04_api/</w:t>
-            </w:r>
-          </w:p>
-        </w:tc>
-        <w:tc>
-          <w:tcPr/>
-          <w:p>
-            <w:pPr>
-              <w:pStyle w:val="Compact"/>
-              <w:jc w:val="left"/>
-            </w:pPr>
-            <w:r>
-              <w:t xml:space="preserve">REST API contracts (NestJS, 30+ endpoints, JWT auth, rate limiting)</w:t>
+              <w:t>docs/04_api/</w:t>
+            </w:r>
+          </w:p>
+        </w:tc>
+        <w:tc>
+          <w:tcPr>
+            <w:tcW w:w="4400" w:type="dxa"/>
+          </w:tcPr>
+          <w:p>
+            <w:pPr>
+              <w:pStyle w:val="Compact"/>
+            </w:pPr>
+            <w:r>
+              <w:t>REST API contracts (NestJS, 30+ endpoints, JWT auth, rate limiting)</w:t>
             </w:r>
           </w:p>
         </w:tc>
       </w:tr>
       <w:tr>
         <w:tc>
-          <w:tcPr/>
-          <w:p>
-            <w:pPr>
-              <w:pStyle w:val="Compact"/>
-              <w:jc w:val="left"/>
+          <w:tcPr>
+            <w:tcW w:w="3520" w:type="dxa"/>
+          </w:tcPr>
+          <w:p>
+            <w:pPr>
+              <w:pStyle w:val="Compact"/>
             </w:pPr>
             <w:r>
               <w:rPr>
                 <w:rStyle w:val="VerbatimChar"/>
               </w:rPr>
-              <w:t xml:space="preserve">docs/05_backend/</w:t>
-            </w:r>
-          </w:p>
-        </w:tc>
-        <w:tc>
-          <w:tcPr/>
-          <w:p>
-            <w:pPr>
-              <w:pStyle w:val="Compact"/>
-              <w:jc w:val="left"/>
-            </w:pPr>
-            <w:r>
-              <w:t xml:space="preserve">Temporal workflows, OCR extraction pipelines, tax rules engine</w:t>
+              <w:t>docs/05_backend/</w:t>
+            </w:r>
+          </w:p>
+        </w:tc>
+        <w:tc>
+          <w:tcPr>
+            <w:tcW w:w="4400" w:type="dxa"/>
+          </w:tcPr>
+          <w:p>
+            <w:pPr>
+              <w:pStyle w:val="Compact"/>
+            </w:pPr>
+            <w:r>
+              <w:t xml:space="preserve">Temporal workflows, OCR extraction </w:t>
+            </w:r>
+            <w:r>
+              <w:lastRenderedPageBreak/>
+              <w:t>pipelines, tax rules engine</w:t>
             </w:r>
           </w:p>
         </w:tc>
       </w:tr>
       <w:tr>
         <w:tc>
-          <w:tcPr/>
-          <w:p>
-            <w:pPr>
-              <w:pStyle w:val="Compact"/>
-              <w:jc w:val="left"/>
+          <w:tcPr>
+            <w:tcW w:w="3520" w:type="dxa"/>
+          </w:tcPr>
+          <w:p>
+            <w:pPr>
+              <w:pStyle w:val="Compact"/>
             </w:pPr>
             <w:r>
               <w:rPr>
                 <w:rStyle w:val="VerbatimChar"/>
               </w:rPr>
-              <w:t xml:space="preserve">docs/06_compliance/</w:t>
-            </w:r>
-          </w:p>
-        </w:tc>
-        <w:tc>
-          <w:tcPr/>
-          <w:p>
-            <w:pPr>
-              <w:pStyle w:val="Compact"/>
-              <w:jc w:val="left"/>
-            </w:pPr>
-            <w:r>
-              <w:t xml:space="preserve">DPDP Act controls, consent gate logic, audit taxonomy, non-ERI boundary</w:t>
+              <w:lastRenderedPageBreak/>
+              <w:t>docs/06_compliance/</w:t>
+            </w:r>
+          </w:p>
+        </w:tc>
+        <w:tc>
+          <w:tcPr>
+            <w:tcW w:w="4400" w:type="dxa"/>
+          </w:tcPr>
+          <w:p>
+            <w:pPr>
+              <w:pStyle w:val="Compact"/>
+            </w:pPr>
+            <w:r>
+              <w:t>DPDP Act controls, consent gate logic, audit taxonomy, non-ERI boundary</w:t>
             </w:r>
           </w:p>
         </w:tc>
       </w:tr>
       <w:tr>
         <w:tc>
-          <w:tcPr/>
-          <w:p>
-            <w:pPr>
-              <w:pStyle w:val="Compact"/>
-              <w:jc w:val="left"/>
+          <w:tcPr>
+            <w:tcW w:w="3520" w:type="dxa"/>
+          </w:tcPr>
+          <w:p>
+            <w:pPr>
+              <w:pStyle w:val="Compact"/>
             </w:pPr>
             <w:r>
               <w:rPr>
                 <w:rStyle w:val="VerbatimChar"/>
               </w:rPr>
-              <w:t xml:space="preserve">docs/07_frontend/</w:t>
-            </w:r>
-          </w:p>
-        </w:tc>
-        <w:tc>
-          <w:tcPr/>
-          <w:p>
-            <w:pPr>
-              <w:pStyle w:val="Compact"/>
-              <w:jc w:val="left"/>
-            </w:pPr>
-            <w:r>
-              <w:t xml:space="preserve">Next.js screen specs, navigation flows, mobile-first vs desktop-first decisions</w:t>
+              <w:t>docs/07_frontend/</w:t>
+            </w:r>
+          </w:p>
+        </w:tc>
+        <w:tc>
+          <w:tcPr>
+            <w:tcW w:w="4400" w:type="dxa"/>
+          </w:tcPr>
+          <w:p>
+            <w:pPr>
+              <w:pStyle w:val="Compact"/>
+            </w:pPr>
+            <w:r>
+              <w:t>Next.js screen specs, navigation flows, mobile-first vs desktop-first decisions</w:t>
             </w:r>
           </w:p>
         </w:tc>
       </w:tr>
       <w:tr>
         <w:tc>
-          <w:tcPr/>
-          <w:p>
-            <w:pPr>
-              <w:pStyle w:val="Compact"/>
-              <w:jc w:val="left"/>
+          <w:tcPr>
+            <w:tcW w:w="3520" w:type="dxa"/>
+          </w:tcPr>
+          <w:p>
+            <w:pPr>
+              <w:pStyle w:val="Compact"/>
             </w:pPr>
             <w:r>
               <w:rPr>
                 <w:rStyle w:val="VerbatimChar"/>
               </w:rPr>
-              <w:t xml:space="preserve">docs/08_admin/</w:t>
-            </w:r>
-          </w:p>
-        </w:tc>
-        <w:tc>
-          <w:tcPr/>
-          <w:p>
-            <w:pPr>
-              <w:pStyle w:val="Compact"/>
-              <w:jc w:val="left"/>
-            </w:pPr>
-            <w:r>
-              <w:t xml:space="preserve">Operations console, RBAC, maker-checker approvals, health monitoring</w:t>
+              <w:t>docs/08_admin/</w:t>
+            </w:r>
+          </w:p>
+        </w:tc>
+        <w:tc>
+          <w:tcPr>
+            <w:tcW w:w="4400" w:type="dxa"/>
+          </w:tcPr>
+          <w:p>
+            <w:pPr>
+              <w:pStyle w:val="Compact"/>
+            </w:pPr>
+            <w:r>
+              <w:t>Operations console, RBAC, maker-checker approvals, health monitoring</w:t>
             </w:r>
           </w:p>
         </w:tc>
       </w:tr>
       <w:tr>
         <w:tc>
-          <w:tcPr/>
-          <w:p>
-            <w:pPr>
-              <w:pStyle w:val="Compact"/>
-              <w:jc w:val="left"/>
+          <w:tcPr>
+            <w:tcW w:w="3520" w:type="dxa"/>
+          </w:tcPr>
+          <w:p>
+            <w:pPr>
+              <w:pStyle w:val="Compact"/>
             </w:pPr>
             <w:r>
               <w:rPr>
                 <w:rStyle w:val="VerbatimChar"/>
               </w:rPr>
-              <w:t xml:space="preserve">docs/09_delivery/</w:t>
-            </w:r>
-          </w:p>
-        </w:tc>
-        <w:tc>
-          <w:tcPr/>
-          <w:p>
-            <w:pPr>
-              <w:pStyle w:val="Compact"/>
-              <w:jc w:val="left"/>
-            </w:pPr>
-            <w:r>
-              <w:t xml:space="preserve">83 implementation chunks across 15 epics, 10-sprint execution plan</w:t>
+              <w:t>docs/09_delivery/</w:t>
+            </w:r>
+          </w:p>
+        </w:tc>
+        <w:tc>
+          <w:tcPr>
+            <w:tcW w:w="4400" w:type="dxa"/>
+          </w:tcPr>
+          <w:p>
+            <w:pPr>
+              <w:pStyle w:val="Compact"/>
+            </w:pPr>
+            <w:r>
+              <w:t>83 implementation chunks across 15 epics, 10-sprint execution plan</w:t>
             </w:r>
           </w:p>
         </w:tc>
       </w:tr>
       <w:tr>
         <w:tc>
-          <w:tcPr/>
-          <w:p>
-            <w:pPr>
-              <w:pStyle w:val="Compact"/>
-              <w:jc w:val="left"/>
-            </w:pPr>
-            <w:r>
-              <w:rPr>
-                <w:rStyle w:val="VerbatimChar"/>
-              </w:rPr>
-              <w:t xml:space="preserve">resume/</w:t>
-            </w:r>
-          </w:p>
-        </w:tc>
-        <w:tc>
-          <w:tcPr/>
-          <w:p>
-            <w:pPr>
-              <w:pStyle w:val="Compact"/>
-              <w:jc w:val="left"/>
-            </w:pPr>
-            <w:r>
-              <w:t xml:space="preserve">Role-tailored resume versions (Data Analyst, Financial Analyst, SWE, BA)</w:t>
-            </w:r>
+          <w:tcPr>
+            <w:tcW w:w="3520" w:type="dxa"/>
+          </w:tcPr>
+          <w:p>
+            <w:pPr>
+              <w:pStyle w:val="Compact"/>
+            </w:pPr>
+          </w:p>
+        </w:tc>
+        <w:tc>
+          <w:tcPr>
+            <w:tcW w:w="4400" w:type="dxa"/>
+          </w:tcPr>
+          <w:p>
+            <w:pPr>
+              <w:pStyle w:val="Compact"/>
+            </w:pPr>
           </w:p>
         </w:tc>
       </w:tr>
     </w:tbl>
     <w:p>
       <w:r>
-        <w:pict>
-          <v:rect style="width:0;height:1.5pt" o:hralign="center" o:hrstd="t" o:hr="t"/>
+        <w:pict w14:anchorId="2E3917EB">
+          <v:rect id="_x0000_i1027" style="width:0;height:1.5pt" o:hralign="center" o:hrstd="t" o:hr="t"/>
         </w:pict>
       </w:r>
     </w:p>
-    <w:bookmarkEnd w:id="22"/>
-    <w:bookmarkStart w:id="23" w:name="key-design-decisions"/>
-    <w:p>
-      <w:pPr>
-        <w:pStyle w:val="2"/>
-      </w:pPr>
-      <w:r>
-        <w:t xml:space="preserve">Key Design Decisions</w:t>
+    <w:p>
+      <w:pPr>
+        <w:pStyle w:val="Heading2"/>
+      </w:pPr>
+      <w:bookmarkStart w:id="3" w:name="key-design-decisions"/>
+      <w:bookmarkEnd w:id="2"/>
+      <w:r>
+        <w:t>Key Design Decisions</w:t>
       </w:r>
     </w:p>
     <w:p>
@@ -475,7 +484,7 @@
         <w:pStyle w:val="Compact"/>
         <w:numPr>
           <w:ilvl w:val="0"/>
-          <w:numId w:val="1001"/>
+          <w:numId w:val="12"/>
         </w:numPr>
       </w:pPr>
       <w:r>
@@ -483,13 +492,10 @@
           <w:b/>
           <w:bCs/>
         </w:rPr>
-        <w:t xml:space="preserve">Modular monolith</w:t>
-      </w:r>
-      <w:r>
-        <w:t xml:space="preserve"> </w:t>
-      </w:r>
-      <w:r>
-        <w:t xml:space="preserve">(NestJS + Next.js + Python workers) — extractable to microservices at scale</w:t>
+        <w:t>Modular monolith</w:t>
+      </w:r>
+      <w:r>
+        <w:t xml:space="preserve"> (NestJS + Next.js + Python workers) — extractable to microservices at scale</w:t>
       </w:r>
     </w:p>
     <w:p>
@@ -497,7 +503,7 @@
         <w:pStyle w:val="Compact"/>
         <w:numPr>
           <w:ilvl w:val="0"/>
-          <w:numId w:val="1001"/>
+          <w:numId w:val="12"/>
         </w:numPr>
       </w:pPr>
       <w:r>
@@ -505,13 +511,10 @@
           <w:b/>
           <w:bCs/>
         </w:rPr>
-        <w:t xml:space="preserve">Temporal workflow orchestration</w:t>
-      </w:r>
-      <w:r>
-        <w:t xml:space="preserve"> </w:t>
-      </w:r>
-      <w:r>
-        <w:t xml:space="preserve">for durable extraction, computation, and audit pipelines</w:t>
+        <w:t>Temporal workflow orchestration</w:t>
+      </w:r>
+      <w:r>
+        <w:t xml:space="preserve"> for durable extraction, computation, and audit pipelines</w:t>
       </w:r>
     </w:p>
     <w:p>
@@ -519,7 +522,7 @@
         <w:pStyle w:val="Compact"/>
         <w:numPr>
           <w:ilvl w:val="0"/>
-          <w:numId w:val="1001"/>
+          <w:numId w:val="12"/>
         </w:numPr>
       </w:pPr>
       <w:r>
@@ -527,13 +530,10 @@
           <w:b/>
           <w:bCs/>
         </w:rPr>
-        <w:t xml:space="preserve">Field-level AES-256-GCM encryption</w:t>
-      </w:r>
-      <w:r>
-        <w:t xml:space="preserve"> </w:t>
-      </w:r>
-      <w:r>
-        <w:t xml:space="preserve">for PAN/phone via AWS KMS</w:t>
+        <w:t>Field-level AES-256-GCM encryption</w:t>
+      </w:r>
+      <w:r>
+        <w:t xml:space="preserve"> for PAN/phone via AWS KMS</w:t>
       </w:r>
     </w:p>
     <w:p>
@@ -541,7 +541,7 @@
         <w:pStyle w:val="Compact"/>
         <w:numPr>
           <w:ilvl w:val="0"/>
-          <w:numId w:val="1001"/>
+          <w:numId w:val="12"/>
         </w:numPr>
       </w:pPr>
       <w:r>
@@ -549,13 +549,10 @@
           <w:b/>
           <w:bCs/>
         </w:rPr>
-        <w:t xml:space="preserve">Append-only immutability</w:t>
-      </w:r>
-      <w:r>
-        <w:t xml:space="preserve"> </w:t>
-      </w:r>
-      <w:r>
-        <w:t xml:space="preserve">for extractions, computations, and audit events</w:t>
+        <w:t>Append-only immutability</w:t>
+      </w:r>
+      <w:r>
+        <w:t xml:space="preserve"> for extractions, computations, and audit events</w:t>
       </w:r>
     </w:p>
     <w:p>
@@ -563,7 +560,7 @@
         <w:pStyle w:val="Compact"/>
         <w:numPr>
           <w:ilvl w:val="0"/>
-          <w:numId w:val="1001"/>
+          <w:numId w:val="12"/>
         </w:numPr>
       </w:pPr>
       <w:r>
@@ -571,224 +568,236 @@
           <w:b/>
           <w:bCs/>
         </w:rPr>
-        <w:t xml:space="preserve">Explicit non-ERI boundary</w:t>
-      </w:r>
-      <w:r>
-        <w:t xml:space="preserve"> </w:t>
-      </w:r>
-      <w:r>
-        <w:t xml:space="preserve">— filing-support only, with disclaimers on every output</w:t>
-      </w:r>
-    </w:p>
-    <w:p>
-      <w:r>
-        <w:pict>
-          <v:rect style="width:0;height:1.5pt" o:hralign="center" o:hrstd="t" o:hr="t"/>
+        <w:t>Explicit non-ERI boundary</w:t>
+      </w:r>
+      <w:r>
+        <w:t xml:space="preserve"> — filing-support only, with disclaimers on every output</w:t>
+      </w:r>
+    </w:p>
+    <w:p>
+      <w:r>
+        <w:pict w14:anchorId="5F5770A1">
+          <v:rect id="_x0000_i1028" style="width:0;height:1.5pt" o:hralign="center" o:hrstd="t" o:hr="t"/>
         </w:pict>
       </w:r>
     </w:p>
-    <w:bookmarkEnd w:id="23"/>
-    <w:bookmarkStart w:id="24" w:name="tech-stack"/>
-    <w:p>
-      <w:pPr>
-        <w:pStyle w:val="2"/>
-      </w:pPr>
-      <w:r>
-        <w:t xml:space="preserve">Tech Stack</w:t>
+    <w:p>
+      <w:pPr>
+        <w:pStyle w:val="Heading2"/>
+      </w:pPr>
+      <w:bookmarkStart w:id="4" w:name="tech-stack"/>
+      <w:bookmarkEnd w:id="3"/>
+      <w:r>
+        <w:t>Tech Stack</w:t>
       </w:r>
     </w:p>
     <w:tbl>
       <w:tblPr>
         <w:tblStyle w:val="Table"/>
-        <w:tblW w:type="auto" w:w="0"/>
-        <w:jc w:val="left"/>
-        <w:tblLook w:firstRow="1" w:lastRow="0" w:firstColumn="0" w:lastColumn="0" w:noHBand="0" w:noVBand="0" w:val="0020"/>
+        <w:tblW w:w="0" w:type="auto"/>
+        <w:tblLook w:val="0020" w:firstRow="1" w:lastRow="0" w:firstColumn="0" w:lastColumn="0" w:noHBand="0" w:noVBand="0"/>
       </w:tblPr>
       <w:tblGrid>
-        <w:gridCol w:w="3960"/>
-        <w:gridCol w:w="3960"/>
+        <w:gridCol w:w="1630"/>
+        <w:gridCol w:w="5712"/>
       </w:tblGrid>
       <w:tr>
         <w:trPr>
-          <w:tblHeader w:val="on"/>
+          <w:cnfStyle w:val="100000000000" w:firstRow="1" w:lastRow="0" w:firstColumn="0" w:lastColumn="0" w:oddVBand="0" w:evenVBand="0" w:oddHBand="0" w:evenHBand="0" w:firstRowFirstColumn="0" w:firstRowLastColumn="0" w:lastRowFirstColumn="0" w:lastRowLastColumn="0"/>
+          <w:tblHeader/>
         </w:trPr>
         <w:tc>
-          <w:tcPr/>
-          <w:p>
-            <w:pPr>
-              <w:pStyle w:val="Compact"/>
-              <w:jc w:val="left"/>
-            </w:pPr>
-            <w:r>
-              <w:t xml:space="preserve">Layer</w:t>
-            </w:r>
-          </w:p>
-        </w:tc>
-        <w:tc>
-          <w:tcPr/>
-          <w:p>
-            <w:pPr>
-              <w:pStyle w:val="Compact"/>
-              <w:jc w:val="left"/>
-            </w:pPr>
-            <w:r>
-              <w:t xml:space="preserve">Technology</w:t>
+          <w:tcPr>
+            <w:tcW w:w="0" w:type="auto"/>
+          </w:tcPr>
+          <w:p>
+            <w:pPr>
+              <w:pStyle w:val="Compact"/>
+            </w:pPr>
+            <w:r>
+              <w:t>Layer</w:t>
+            </w:r>
+          </w:p>
+        </w:tc>
+        <w:tc>
+          <w:tcPr>
+            <w:tcW w:w="0" w:type="auto"/>
+          </w:tcPr>
+          <w:p>
+            <w:pPr>
+              <w:pStyle w:val="Compact"/>
+            </w:pPr>
+            <w:r>
+              <w:t>Technology</w:t>
             </w:r>
           </w:p>
         </w:tc>
       </w:tr>
       <w:tr>
         <w:tc>
-          <w:tcPr/>
-          <w:p>
-            <w:pPr>
-              <w:pStyle w:val="Compact"/>
-              <w:jc w:val="left"/>
-            </w:pPr>
-            <w:r>
-              <w:t xml:space="preserve">Frontend</w:t>
-            </w:r>
-          </w:p>
-        </w:tc>
-        <w:tc>
-          <w:tcPr/>
-          <w:p>
-            <w:pPr>
-              <w:pStyle w:val="Compact"/>
-              <w:jc w:val="left"/>
-            </w:pPr>
-            <w:r>
-              <w:t xml:space="preserve">Next.js 14, TypeScript, Tailwind CSS</w:t>
+          <w:tcPr>
+            <w:tcW w:w="0" w:type="auto"/>
+          </w:tcPr>
+          <w:p>
+            <w:pPr>
+              <w:pStyle w:val="Compact"/>
+            </w:pPr>
+            <w:r>
+              <w:t>Frontend</w:t>
+            </w:r>
+          </w:p>
+        </w:tc>
+        <w:tc>
+          <w:tcPr>
+            <w:tcW w:w="0" w:type="auto"/>
+          </w:tcPr>
+          <w:p>
+            <w:pPr>
+              <w:pStyle w:val="Compact"/>
+            </w:pPr>
+            <w:r>
+              <w:t>Next.js 14, TypeScript, Tailwind CSS</w:t>
             </w:r>
           </w:p>
         </w:tc>
       </w:tr>
       <w:tr>
         <w:tc>
-          <w:tcPr/>
-          <w:p>
-            <w:pPr>
-              <w:pStyle w:val="Compact"/>
-              <w:jc w:val="left"/>
-            </w:pPr>
-            <w:r>
-              <w:t xml:space="preserve">API</w:t>
-            </w:r>
-          </w:p>
-        </w:tc>
-        <w:tc>
-          <w:tcPr/>
-          <w:p>
-            <w:pPr>
-              <w:pStyle w:val="Compact"/>
-              <w:jc w:val="left"/>
-            </w:pPr>
-            <w:r>
-              <w:t xml:space="preserve">NestJS, TypeScript, TypeORM, class-validator</w:t>
+          <w:tcPr>
+            <w:tcW w:w="0" w:type="auto"/>
+          </w:tcPr>
+          <w:p>
+            <w:pPr>
+              <w:pStyle w:val="Compact"/>
+            </w:pPr>
+            <w:r>
+              <w:t>API</w:t>
+            </w:r>
+          </w:p>
+        </w:tc>
+        <w:tc>
+          <w:tcPr>
+            <w:tcW w:w="0" w:type="auto"/>
+          </w:tcPr>
+          <w:p>
+            <w:pPr>
+              <w:pStyle w:val="Compact"/>
+            </w:pPr>
+            <w:r>
+              <w:t>NestJS, TypeScript, TypeORM, class-validator</w:t>
             </w:r>
           </w:p>
         </w:tc>
       </w:tr>
       <w:tr>
         <w:tc>
-          <w:tcPr/>
-          <w:p>
-            <w:pPr>
-              <w:pStyle w:val="Compact"/>
-              <w:jc w:val="left"/>
-            </w:pPr>
-            <w:r>
-              <w:t xml:space="preserve">Workers</w:t>
-            </w:r>
-          </w:p>
-        </w:tc>
-        <w:tc>
-          <w:tcPr/>
-          <w:p>
-            <w:pPr>
-              <w:pStyle w:val="Compact"/>
-              <w:jc w:val="left"/>
-            </w:pPr>
-            <w:r>
-              <w:t xml:space="preserve">Python, FastAPI, Temporal, pdf2image, WeasyPrint</w:t>
+          <w:tcPr>
+            <w:tcW w:w="0" w:type="auto"/>
+          </w:tcPr>
+          <w:p>
+            <w:pPr>
+              <w:pStyle w:val="Compact"/>
+            </w:pPr>
+            <w:r>
+              <w:t>Workers</w:t>
+            </w:r>
+          </w:p>
+        </w:tc>
+        <w:tc>
+          <w:tcPr>
+            <w:tcW w:w="0" w:type="auto"/>
+          </w:tcPr>
+          <w:p>
+            <w:pPr>
+              <w:pStyle w:val="Compact"/>
+            </w:pPr>
+            <w:r>
+              <w:t>Python, FastAPI, Temporal, pdf2image, WeasyPrint</w:t>
             </w:r>
           </w:p>
         </w:tc>
       </w:tr>
       <w:tr>
         <w:tc>
-          <w:tcPr/>
-          <w:p>
-            <w:pPr>
-              <w:pStyle w:val="Compact"/>
-              <w:jc w:val="left"/>
-            </w:pPr>
-            <w:r>
-              <w:t xml:space="preserve">Database</w:t>
-            </w:r>
-          </w:p>
-        </w:tc>
-        <w:tc>
-          <w:tcPr/>
-          <w:p>
-            <w:pPr>
-              <w:pStyle w:val="Compact"/>
-              <w:jc w:val="left"/>
-            </w:pPr>
-            <w:r>
-              <w:t xml:space="preserve">PostgreSQL 15, Redis 7, PgBouncer</w:t>
+          <w:tcPr>
+            <w:tcW w:w="0" w:type="auto"/>
+          </w:tcPr>
+          <w:p>
+            <w:pPr>
+              <w:pStyle w:val="Compact"/>
+            </w:pPr>
+            <w:r>
+              <w:lastRenderedPageBreak/>
+              <w:t>Database</w:t>
+            </w:r>
+          </w:p>
+        </w:tc>
+        <w:tc>
+          <w:tcPr>
+            <w:tcW w:w="0" w:type="auto"/>
+          </w:tcPr>
+          <w:p>
+            <w:pPr>
+              <w:pStyle w:val="Compact"/>
+            </w:pPr>
+            <w:r>
+              <w:t>PostgreSQL 15, Redis 7, PgBouncer</w:t>
             </w:r>
           </w:p>
         </w:tc>
       </w:tr>
       <w:tr>
         <w:tc>
-          <w:tcPr/>
-          <w:p>
-            <w:pPr>
-              <w:pStyle w:val="Compact"/>
-              <w:jc w:val="left"/>
-            </w:pPr>
-            <w:r>
-              <w:t xml:space="preserve">Infrastructure</w:t>
-            </w:r>
-          </w:p>
-        </w:tc>
-        <w:tc>
-          <w:tcPr/>
-          <w:p>
-            <w:pPr>
-              <w:pStyle w:val="Compact"/>
-              <w:jc w:val="left"/>
-            </w:pPr>
-            <w:r>
-              <w:t xml:space="preserve">AWS S3 (ap-south-1), KMS, SES, ECS Fargate</w:t>
+          <w:tcPr>
+            <w:tcW w:w="0" w:type="auto"/>
+          </w:tcPr>
+          <w:p>
+            <w:pPr>
+              <w:pStyle w:val="Compact"/>
+            </w:pPr>
+            <w:r>
+              <w:t>Infrastructure</w:t>
+            </w:r>
+          </w:p>
+        </w:tc>
+        <w:tc>
+          <w:tcPr>
+            <w:tcW w:w="0" w:type="auto"/>
+          </w:tcPr>
+          <w:p>
+            <w:pPr>
+              <w:pStyle w:val="Compact"/>
+            </w:pPr>
+            <w:r>
+              <w:t>AWS S3 (ap-south-1), KMS, SES, ECS Fargate</w:t>
             </w:r>
           </w:p>
         </w:tc>
       </w:tr>
       <w:tr>
         <w:tc>
-          <w:tcPr/>
-          <w:p>
-            <w:pPr>
-              <w:pStyle w:val="Compact"/>
-              <w:jc w:val="left"/>
-            </w:pPr>
-            <w:r>
-              <w:t xml:space="preserve">DevOps</w:t>
-            </w:r>
-          </w:p>
-        </w:tc>
-        <w:tc>
-          <w:tcPr/>
-          <w:p>
-            <w:pPr>
-              <w:pStyle w:val="Compact"/>
-              <w:jc w:val="left"/>
-            </w:pPr>
-            <w:r>
-              <w:t xml:space="preserve">Docker, GitHub Actions, pnpm workspaces</w:t>
+          <w:tcPr>
+            <w:tcW w:w="0" w:type="auto"/>
+          </w:tcPr>
+          <w:p>
+            <w:pPr>
+              <w:pStyle w:val="Compact"/>
+            </w:pPr>
+            <w:r>
+              <w:t>DevOps</w:t>
+            </w:r>
+          </w:p>
+        </w:tc>
+        <w:tc>
+          <w:tcPr>
+            <w:tcW w:w="0" w:type="auto"/>
+          </w:tcPr>
+          <w:p>
+            <w:pPr>
+              <w:pStyle w:val="Compact"/>
+            </w:pPr>
+            <w:r>
+              <w:t>Docker, GitHub Actions, pnpm workspaces</w:t>
             </w:r>
           </w:p>
         </w:tc>
@@ -796,19 +805,19 @@
     </w:tbl>
     <w:p>
       <w:r>
-        <w:pict>
-          <v:rect style="width:0;height:1.5pt" o:hralign="center" o:hrstd="t" o:hr="t"/>
+        <w:pict w14:anchorId="3888BDA9">
+          <v:rect id="_x0000_i1029" style="width:0;height:1.5pt" o:hralign="center" o:hrstd="t" o:hr="t"/>
         </w:pict>
       </w:r>
     </w:p>
-    <w:bookmarkEnd w:id="24"/>
-    <w:bookmarkStart w:id="25" w:name="compliance-risk-posture"/>
-    <w:p>
-      <w:pPr>
-        <w:pStyle w:val="2"/>
-      </w:pPr>
-      <w:r>
-        <w:t xml:space="preserve">Compliance &amp; Risk Posture</w:t>
+    <w:p>
+      <w:pPr>
+        <w:pStyle w:val="Heading2"/>
+      </w:pPr>
+      <w:bookmarkStart w:id="5" w:name="compliance-risk-posture"/>
+      <w:bookmarkEnd w:id="4"/>
+      <w:r>
+        <w:t>Compliance &amp; Risk Posture</w:t>
       </w:r>
     </w:p>
     <w:p>
@@ -816,7 +825,7 @@
         <w:pStyle w:val="Compact"/>
         <w:numPr>
           <w:ilvl w:val="0"/>
-          <w:numId w:val="1002"/>
+          <w:numId w:val="13"/>
         </w:numPr>
       </w:pPr>
       <w:r>
@@ -824,13 +833,10 @@
           <w:b/>
           <w:bCs/>
         </w:rPr>
-        <w:t xml:space="preserve">DPDP Act 2023:</w:t>
-      </w:r>
-      <w:r>
-        <w:t xml:space="preserve"> </w:t>
-      </w:r>
-      <w:r>
-        <w:t xml:space="preserve">consent-first data collection, right to erasure via Temporal W7</w:t>
+        <w:t>DPDP Act 2023:</w:t>
+      </w:r>
+      <w:r>
+        <w:t xml:space="preserve"> consent-first data collection, right to erasure via Temporal W7</w:t>
       </w:r>
     </w:p>
     <w:p>
@@ -838,7 +844,7 @@
         <w:pStyle w:val="Compact"/>
         <w:numPr>
           <w:ilvl w:val="0"/>
-          <w:numId w:val="1002"/>
+          <w:numId w:val="13"/>
         </w:numPr>
       </w:pPr>
       <w:r>
@@ -846,13 +852,10 @@
           <w:b/>
           <w:bCs/>
         </w:rPr>
-        <w:t xml:space="preserve">IT Act 2000 / SPDI Rules 2011:</w:t>
-      </w:r>
-      <w:r>
-        <w:t xml:space="preserve"> </w:t>
-      </w:r>
-      <w:r>
-        <w:t xml:space="preserve">reasonable security practices, 7-year audit retention</w:t>
+        <w:t>IT Act 2000 / SPDI Rules 2011:</w:t>
+      </w:r>
+      <w:r>
+        <w:t xml:space="preserve"> reasonable security practices, 7-year audit retention</w:t>
       </w:r>
     </w:p>
     <w:p>
@@ -860,7 +863,7 @@
         <w:pStyle w:val="Compact"/>
         <w:numPr>
           <w:ilvl w:val="0"/>
-          <w:numId w:val="1002"/>
+          <w:numId w:val="13"/>
         </w:numPr>
       </w:pPr>
       <w:r>
@@ -868,54 +871,34 @@
           <w:b/>
           <w:bCs/>
         </w:rPr>
-        <w:t xml:space="preserve">Non-ERI boundary:</w:t>
-      </w:r>
-      <w:r>
-        <w:t xml:space="preserve"> </w:t>
-      </w:r>
-      <w:r>
-        <w:t xml:space="preserve">never claims to file returns; all outputs labeled</w:t>
-      </w:r>
-      <w:r>
-        <w:t xml:space="preserve"> </w:t>
+        <w:t>Non-ERI boundary:</w:t>
+      </w:r>
+      <w:r>
+        <w:t xml:space="preserve"> never claims to file returns; all outputs labeled </w:t>
       </w:r>
       <w:r>
         <w:rPr>
           <w:i/>
           <w:iCs/>
         </w:rPr>
-        <w:t xml:space="preserve">“</w:t>
-      </w:r>
-      <w:r>
-        <w:rPr>
-          <w:i/>
-          <w:iCs/>
-        </w:rPr>
-        <w:t xml:space="preserve">ESTIMATE ONLY</w:t>
-      </w:r>
-      <w:r>
-        <w:rPr>
-          <w:i/>
-          <w:iCs/>
-        </w:rPr>
-        <w:t xml:space="preserve">”</w:t>
-      </w:r>
-    </w:p>
-    <w:p>
-      <w:r>
-        <w:pict>
-          <v:rect style="width:0;height:1.5pt" o:hralign="center" o:hrstd="t" o:hr="t"/>
+        <w:t>“ESTIMATE ONLY”</w:t>
+      </w:r>
+    </w:p>
+    <w:p>
+      <w:r>
+        <w:pict w14:anchorId="70E0C8D2">
+          <v:rect id="_x0000_i1030" style="width:0;height:1.5pt" o:hralign="center" o:hrstd="t" o:hr="t"/>
         </w:pict>
       </w:r>
     </w:p>
-    <w:bookmarkEnd w:id="25"/>
-    <w:bookmarkStart w:id="29" w:name="quick-start-for-reviewers"/>
-    <w:p>
-      <w:pPr>
-        <w:pStyle w:val="2"/>
-      </w:pPr>
-      <w:r>
-        <w:t xml:space="preserve">Quick-Start for Reviewers</w:t>
+    <w:p>
+      <w:pPr>
+        <w:pStyle w:val="Heading2"/>
+      </w:pPr>
+      <w:bookmarkStart w:id="6" w:name="quick-start-for-reviewers"/>
+      <w:bookmarkEnd w:id="5"/>
+      <w:r>
+        <w:t>Quick-Start for Reviewers</w:t>
       </w:r>
     </w:p>
     <w:p>
@@ -923,7 +906,7 @@
         <w:pStyle w:val="Compact"/>
         <w:numPr>
           <w:ilvl w:val="0"/>
-          <w:numId w:val="1003"/>
+          <w:numId w:val="14"/>
         </w:numPr>
       </w:pPr>
       <w:r>
@@ -931,30 +914,21 @@
           <w:b/>
           <w:bCs/>
         </w:rPr>
-        <w:t xml:space="preserve">Recruiters / Hiring Managers:</w:t>
-      </w:r>
-      <w:r>
-        <w:t xml:space="preserve"> </w:t>
-      </w:r>
-      <w:r>
-        <w:t xml:space="preserve">Start with</w:t>
-      </w:r>
-      <w:r>
-        <w:t xml:space="preserve"> </w:t>
-      </w:r>
-      <w:hyperlink r:id="rId26">
+        <w:t>Recruiters / Hiring Managers:</w:t>
+      </w:r>
+      <w:r>
+        <w:t xml:space="preserve"> Start with </w:t>
+      </w:r>
+      <w:hyperlink r:id="rId8">
         <w:r>
           <w:rPr>
             <w:rStyle w:val="VerbatimChar"/>
           </w:rPr>
-          <w:t xml:space="preserve">ARCHITECTURE.md</w:t>
+          <w:t>ARCHITECTURE.md</w:t>
         </w:r>
       </w:hyperlink>
       <w:r>
-        <w:t xml:space="preserve"> </w:t>
-      </w:r>
-      <w:r>
-        <w:t xml:space="preserve">for a 2-minute system overview.</w:t>
+        <w:t xml:space="preserve"> for a 2-minute system overview.</w:t>
       </w:r>
     </w:p>
     <w:p>
@@ -962,7 +936,7 @@
         <w:pStyle w:val="Compact"/>
         <w:numPr>
           <w:ilvl w:val="0"/>
-          <w:numId w:val="1003"/>
+          <w:numId w:val="14"/>
         </w:numPr>
       </w:pPr>
       <w:r>
@@ -970,30 +944,21 @@
           <w:b/>
           <w:bCs/>
         </w:rPr>
-        <w:t xml:space="preserve">Engineers:</w:t>
-      </w:r>
-      <w:r>
-        <w:t xml:space="preserve"> </w:t>
-      </w:r>
-      <w:r>
-        <w:t xml:space="preserve">Jump to</w:t>
-      </w:r>
-      <w:r>
-        <w:t xml:space="preserve"> </w:t>
-      </w:r>
-      <w:hyperlink r:id="rId27">
+        <w:t>Engineers:</w:t>
+      </w:r>
+      <w:r>
+        <w:t xml:space="preserve"> Jump to </w:t>
+      </w:r>
+      <w:hyperlink r:id="rId9">
         <w:r>
           <w:rPr>
             <w:rStyle w:val="VerbatimChar"/>
           </w:rPr>
-          <w:t xml:space="preserve">docs/09_delivery/14a_index.md</w:t>
+          <w:t>docs/09_delivery/14a_index.md</w:t>
         </w:r>
       </w:hyperlink>
       <w:r>
-        <w:t xml:space="preserve"> </w:t>
-      </w:r>
-      <w:r>
-        <w:t xml:space="preserve">for the 83-chunk implementation roadmap.</w:t>
+        <w:t xml:space="preserve"> for the 83-chunk implementation roadmap.</w:t>
       </w:r>
     </w:p>
     <w:p>
@@ -1001,7 +966,7 @@
         <w:pStyle w:val="Compact"/>
         <w:numPr>
           <w:ilvl w:val="0"/>
-          <w:numId w:val="1003"/>
+          <w:numId w:val="14"/>
         </w:numPr>
       </w:pPr>
       <w:r>
@@ -1009,47 +974,38 @@
           <w:b/>
           <w:bCs/>
         </w:rPr>
-        <w:t xml:space="preserve">Compliance / Legal:</w:t>
-      </w:r>
-      <w:r>
-        <w:t xml:space="preserve"> </w:t>
-      </w:r>
-      <w:r>
-        <w:t xml:space="preserve">See</w:t>
-      </w:r>
-      <w:r>
-        <w:t xml:space="preserve"> </w:t>
-      </w:r>
-      <w:hyperlink r:id="rId28">
+        <w:t>Compliance / Legal:</w:t>
+      </w:r>
+      <w:r>
+        <w:t xml:space="preserve"> See </w:t>
+      </w:r>
+      <w:hyperlink r:id="rId10">
         <w:r>
           <w:rPr>
             <w:rStyle w:val="VerbatimChar"/>
           </w:rPr>
-          <w:t xml:space="preserve">docs/06_compliance/10_compliance.md</w:t>
+          <w:t>docs/06_compliance/10_compliance.md</w:t>
         </w:r>
       </w:hyperlink>
       <w:r>
-        <w:t xml:space="preserve"> </w:t>
-      </w:r>
-      <w:r>
-        <w:t xml:space="preserve">for the full controls matrix.</w:t>
-      </w:r>
-    </w:p>
-    <w:p>
-      <w:r>
-        <w:pict>
-          <v:rect style="width:0;height:1.5pt" o:hralign="center" o:hrstd="t" o:hr="t"/>
+        <w:t xml:space="preserve"> for the full controls matrix.</w:t>
+      </w:r>
+    </w:p>
+    <w:p>
+      <w:r>
+        <w:pict w14:anchorId="7A85049D">
+          <v:rect id="_x0000_i1031" style="width:0;height:1.5pt" o:hralign="center" o:hrstd="t" o:hr="t"/>
         </w:pict>
       </w:r>
     </w:p>
-    <w:bookmarkEnd w:id="29"/>
-    <w:bookmarkStart w:id="31" w:name="delivery-backlog"/>
-    <w:p>
-      <w:pPr>
-        <w:pStyle w:val="2"/>
-      </w:pPr>
-      <w:r>
-        <w:t xml:space="preserve">Delivery Backlog</w:t>
+    <w:p>
+      <w:pPr>
+        <w:pStyle w:val="Heading2"/>
+      </w:pPr>
+      <w:bookmarkStart w:id="7" w:name="delivery-backlog"/>
+      <w:bookmarkEnd w:id="6"/>
+      <w:r>
+        <w:t>Delivery Backlog</w:t>
       </w:r>
     </w:p>
     <w:p>
@@ -1057,114 +1013,60 @@
         <w:pStyle w:val="FirstParagraph"/>
       </w:pPr>
       <w:r>
-        <w:t xml:space="preserve">See</w:t>
-      </w:r>
-      <w:r>
-        <w:t xml:space="preserve"> </w:t>
-      </w:r>
-      <w:hyperlink r:id="rId30">
+        <w:t xml:space="preserve">See </w:t>
+      </w:r>
+      <w:hyperlink r:id="rId11">
         <w:r>
           <w:rPr>
             <w:rStyle w:val="VerbatimChar"/>
           </w:rPr>
-          <w:t xml:space="preserve">docs/09_delivery/</w:t>
+          <w:t>docs/09_delivery/</w:t>
         </w:r>
       </w:hyperlink>
       <w:r>
-        <w:t xml:space="preserve"> </w:t>
-      </w:r>
-      <w:r>
-        <w:t xml:space="preserve">for the implementation backlog:</w:t>
-      </w:r>
-      <w:r>
-        <w:t xml:space="preserve"> </w:t>
-      </w:r>
-      <w:r>
-        <w:t xml:space="preserve">-</w:t>
-      </w:r>
-      <w:r>
-        <w:t xml:space="preserve"> </w:t>
+        <w:t xml:space="preserve"> for the implementation backlog: - </w:t>
       </w:r>
       <w:r>
         <w:rPr>
           <w:rStyle w:val="VerbatimChar"/>
         </w:rPr>
-        <w:t xml:space="preserve">14a_index.md</w:t>
-      </w:r>
-      <w:r>
-        <w:t xml:space="preserve"> </w:t>
-      </w:r>
-      <w:r>
-        <w:t xml:space="preserve">— Master context + chunk index (C01–C83)</w:t>
-      </w:r>
-      <w:r>
-        <w:t xml:space="preserve"> </w:t>
-      </w:r>
-      <w:r>
-        <w:t xml:space="preserve">-</w:t>
-      </w:r>
-      <w:r>
-        <w:t xml:space="preserve"> </w:t>
+        <w:t>14a_index.md</w:t>
+      </w:r>
+      <w:r>
+        <w:t xml:space="preserve"> — Master context + chunk index (C01–C83) - </w:t>
       </w:r>
       <w:r>
         <w:rPr>
           <w:rStyle w:val="VerbatimChar"/>
         </w:rPr>
-        <w:t xml:space="preserve">14b_epics_01_05.md</w:t>
-      </w:r>
-      <w:r>
-        <w:t xml:space="preserve"> </w:t>
-      </w:r>
-      <w:r>
-        <w:t xml:space="preserve">— Epics E01–E05 (Infrastructure → OCR Workers)</w:t>
-      </w:r>
-      <w:r>
-        <w:t xml:space="preserve"> </w:t>
-      </w:r>
-      <w:r>
-        <w:t xml:space="preserve">-</w:t>
-      </w:r>
-      <w:r>
-        <w:t xml:space="preserve"> </w:t>
+        <w:t>14b_epics_01_05.md</w:t>
+      </w:r>
+      <w:r>
+        <w:t xml:space="preserve"> — Epics E01–E05 (Infrastructure → OCR Workers) - </w:t>
       </w:r>
       <w:r>
         <w:rPr>
           <w:rStyle w:val="VerbatimChar"/>
         </w:rPr>
-        <w:t xml:space="preserve">14c_epics_06_10.md</w:t>
-      </w:r>
-      <w:r>
-        <w:t xml:space="preserve"> </w:t>
-      </w:r>
-      <w:r>
-        <w:t xml:space="preserve">— Epics E06–E10 (Extraction UI → Frontend Auth)</w:t>
-      </w:r>
-      <w:r>
-        <w:t xml:space="preserve"> </w:t>
-      </w:r>
-      <w:r>
-        <w:t xml:space="preserve">-</w:t>
-      </w:r>
-      <w:r>
-        <w:t xml:space="preserve"> </w:t>
+        <w:t>14c_epics_06_10.md</w:t>
+      </w:r>
+      <w:r>
+        <w:t xml:space="preserve"> — Epics E06–E10 (Extraction UI → Frontend Auth) - </w:t>
       </w:r>
       <w:r>
         <w:rPr>
           <w:rStyle w:val="VerbatimChar"/>
         </w:rPr>
-        <w:t xml:space="preserve">14d_epics_11_15.md</w:t>
-      </w:r>
-      <w:r>
-        <w:t xml:space="preserve"> </w:t>
-      </w:r>
-      <w:r>
-        <w:t xml:space="preserve">— Epics E11–E15 (Frontend Docs → Security Hardening)</w:t>
-      </w:r>
-    </w:p>
-    <w:p>
-      <w:r>
-        <w:pict>
-          <v:rect style="width:0;height:1.5pt" o:hralign="center" o:hrstd="t" o:hr="t"/>
+        <w:t>14d_epics_11_15.md</w:t>
+      </w:r>
+      <w:r>
+        <w:t xml:space="preserve"> — Epics E11–E15 (Frontend Docs → Security Hardening)</w:t>
+      </w:r>
+    </w:p>
+    <w:p>
+      <w:r>
+        <w:pict w14:anchorId="5C0F03A1">
+          <v:rect id="_x0000_i1032" style="width:0;height:1.5pt" o:hralign="center" o:hrstd="t" o:hr="t"/>
         </w:pict>
       </w:r>
     </w:p>
@@ -1177,29 +1079,26 @@
           <w:b/>
           <w:bCs/>
         </w:rPr>
-        <w:t xml:space="preserve">Contact:</w:t>
-      </w:r>
-      <w:r>
-        <w:t xml:space="preserve"> </w:t>
-      </w:r>
-      <w:r>
-        <w:t xml:space="preserve">sahilzafar12001@gmail.com | Jabalpur, Madhya Pradesh, India</w:t>
-      </w:r>
-    </w:p>
-    <w:bookmarkEnd w:id="31"/>
-    <w:bookmarkEnd w:id="32"/>
+        <w:t>Contact:</w:t>
+      </w:r>
+      <w:r>
+        <w:t xml:space="preserve"> sahilzafar1201@gmail.com | Jabalpur, Madhya Pradesh, India</w:t>
+      </w:r>
+      <w:bookmarkEnd w:id="0"/>
+      <w:bookmarkEnd w:id="7"/>
+    </w:p>
     <w:sectPr>
-      <w:headerReference r:id="rId9" w:type="even"/>
-      <w:headerReference r:id="rId11" w:type="default"/>
-      <w:footerReference r:id="rId14" w:type="even"/>
-      <w:footerReference r:id="rId13" w:type="default"/>
-      <w:headerReference r:id="rId10" w:type="first"/>
-      <w:footerReference r:id="rId12" w:type="first"/>
+      <w:headerReference w:type="even" r:id="rId12"/>
+      <w:headerReference w:type="default" r:id="rId13"/>
+      <w:footerReference w:type="even" r:id="rId14"/>
+      <w:footerReference w:type="default" r:id="rId15"/>
+      <w:headerReference w:type="first" r:id="rId16"/>
+      <w:footerReference w:type="first" r:id="rId17"/>
       <w:footnotePr>
         <w:numRestart w:val="eachSect"/>
       </w:footnotePr>
-      <w:pgSz w:h="15840" w:w="12240"/>
-      <w:pgMar w:bottom="1440" w:footer="1020" w:gutter="0" w:header="720" w:left="1800" w:right="1800" w:top="1440"/>
+      <w:pgSz w:w="12240" w:h="15840"/>
+      <w:pgMar w:top="1440" w:right="1800" w:bottom="1440" w:left="1800" w:header="720" w:footer="1020" w:gutter="0"/>
       <w:cols w:space="720"/>
       <w:docGrid w:linePitch="326"/>
     </w:sectPr>
@@ -1207,15 +1106,36 @@
 </w:document>
 </file>
 
-<file path=word/comments.xml><?xml version="1.0" encoding="utf-8"?>
-<w:comments xmlns:w="http://schemas.openxmlformats.org/wordprocessingml/2006/main" xmlns:m="http://schemas.openxmlformats.org/officeDocument/2006/math" xmlns:r="http://schemas.openxmlformats.org/officeDocument/2006/relationships" xmlns:o="urn:schemas-microsoft-com:office:office" xmlns:v="urn:schemas-microsoft-com:vml" xmlns:w10="urn:schemas-microsoft-com:office:word" xmlns:a="http://schemas.openxmlformats.org/drawingml/2006/main" xmlns:pic="http://schemas.openxmlformats.org/drawingml/2006/picture" xmlns:wp="http://schemas.openxmlformats.org/drawingml/2006/wordprocessingDrawing"/>
+<file path=word/endnotes.xml><?xml version="1.0" encoding="utf-8"?>
+<w:endnotes xmlns:wpc="http://schemas.microsoft.com/office/word/2010/wordprocessingCanvas" xmlns:cx="http://schemas.microsoft.com/office/drawing/2014/chartex" xmlns:cx1="http://schemas.microsoft.com/office/drawing/2015/9/8/chartex" xmlns:cx2="http://schemas.microsoft.com/office/drawing/2015/10/21/chartex" xmlns:cx3="http://schemas.microsoft.com/office/drawing/2016/5/9/chartex" xmlns:cx4="http://schemas.microsoft.com/office/drawing/2016/5/10/chartex" xmlns:cx5="http://schemas.microsoft.com/office/drawing/2016/5/11/chartex" xmlns:cx6="http://schemas.microsoft.com/office/drawing/2016/5/12/chartex" xmlns:cx7="http://schemas.microsoft.com/office/drawing/2016/5/13/chartex" xmlns:cx8="http://schemas.microsoft.com/office/drawing/2016/5/14/chartex" xmlns:mc="http://schemas.openxmlformats.org/markup-compatibility/2006" xmlns:aink="http://schemas.microsoft.com/office/drawing/2016/ink" xmlns:am3d="http://schemas.microsoft.com/office/drawing/2017/model3d" xmlns:o="urn:schemas-microsoft-com:office:office" xmlns:oel="http://schemas.microsoft.com/office/2019/extlst" xmlns:r="http://schemas.openxmlformats.org/officeDocument/2006/relationships" xmlns:m="http://schemas.openxmlformats.org/officeDocument/2006/math" xmlns:v="urn:schemas-microsoft-com:vml" xmlns:wp14="http://schemas.microsoft.com/office/word/2010/wordprocessingDrawing" xmlns:wp="http://schemas.openxmlformats.org/drawingml/2006/wordprocessingDrawing" xmlns:w10="urn:schemas-microsoft-com:office:word" xmlns:w="http://schemas.openxmlformats.org/wordprocessingml/2006/main" xmlns:w14="http://schemas.microsoft.com/office/word/2010/wordml" xmlns:w15="http://schemas.microsoft.com/office/word/2012/wordml" xmlns:w16cex="http://schemas.microsoft.com/office/word/2018/wordml/cex" xmlns:w16cid="http://schemas.microsoft.com/office/word/2016/wordml/cid" xmlns:w16="http://schemas.microsoft.com/office/word/2018/wordml" xmlns:w16du="http://schemas.microsoft.com/office/word/2023/wordml/word16du" xmlns:w16sdtdh="http://schemas.microsoft.com/office/word/2020/wordml/sdtdatahash" xmlns:w16sdtfl="http://schemas.microsoft.com/office/word/2024/wordml/sdtformatlock" xmlns:w16se="http://schemas.microsoft.com/office/word/2015/wordml/symex" xmlns:wpg="http://schemas.microsoft.com/office/word/2010/wordprocessingGroup" xmlns:wpi="http://schemas.microsoft.com/office/word/2010/wordprocessingInk" xmlns:wne="http://schemas.microsoft.com/office/word/2006/wordml" xmlns:wps="http://schemas.microsoft.com/office/word/2010/wordprocessingShape" mc:Ignorable="w14 w15 w16se w16cid w16 w16cex w16sdtdh w16sdtfl w16du wp14">
+  <w:endnote w:type="separator" w:id="-1">
+    <w:p>
+      <w:pPr>
+        <w:spacing w:line="240" w:lineRule="auto"/>
+      </w:pPr>
+      <w:r>
+        <w:separator/>
+      </w:r>
+    </w:p>
+  </w:endnote>
+  <w:endnote w:type="continuationSeparator" w:id="0">
+    <w:p>
+      <w:pPr>
+        <w:spacing w:line="240" w:lineRule="auto"/>
+      </w:pPr>
+      <w:r>
+        <w:continuationSeparator/>
+      </w:r>
+    </w:p>
+  </w:endnote>
+</w:endnotes>
 </file>
 
 <file path=word/footer1.xml><?xml version="1.0" encoding="utf-8"?>
 <w:ftr xmlns:wpc="http://schemas.microsoft.com/office/word/2010/wordprocessingCanvas" xmlns:cx="http://schemas.microsoft.com/office/drawing/2014/chartex" xmlns:cx1="http://schemas.microsoft.com/office/drawing/2015/9/8/chartex" xmlns:cx2="http://schemas.microsoft.com/office/drawing/2015/10/21/chartex" xmlns:cx3="http://schemas.microsoft.com/office/drawing/2016/5/9/chartex" xmlns:cx4="http://schemas.microsoft.com/office/drawing/2016/5/10/chartex" xmlns:cx5="http://schemas.microsoft.com/office/drawing/2016/5/11/chartex" xmlns:cx6="http://schemas.microsoft.com/office/drawing/2016/5/12/chartex" xmlns:cx7="http://schemas.microsoft.com/office/drawing/2016/5/13/chartex" xmlns:cx8="http://schemas.microsoft.com/office/drawing/2016/5/14/chartex" xmlns:mc="http://schemas.openxmlformats.org/markup-compatibility/2006" xmlns:aink="http://schemas.microsoft.com/office/drawing/2016/ink" xmlns:am3d="http://schemas.microsoft.com/office/drawing/2017/model3d" xmlns:o="urn:schemas-microsoft-com:office:office" xmlns:oel="http://schemas.microsoft.com/office/2019/extlst" xmlns:r="http://schemas.openxmlformats.org/officeDocument/2006/relationships" xmlns:m="http://schemas.openxmlformats.org/officeDocument/2006/math" xmlns:v="urn:schemas-microsoft-com:vml" xmlns:wp14="http://schemas.microsoft.com/office/word/2010/wordprocessingDrawing" xmlns:wp="http://schemas.openxmlformats.org/drawingml/2006/wordprocessingDrawing" xmlns:w10="urn:schemas-microsoft-com:office:word" xmlns:w="http://schemas.openxmlformats.org/wordprocessingml/2006/main" xmlns:w14="http://schemas.microsoft.com/office/word/2010/wordml" xmlns:w15="http://schemas.microsoft.com/office/word/2012/wordml" xmlns:w16cex="http://schemas.microsoft.com/office/word/2018/wordml/cex" xmlns:w16cid="http://schemas.microsoft.com/office/word/2016/wordml/cid" xmlns:w16="http://schemas.microsoft.com/office/word/2018/wordml" xmlns:w16du="http://schemas.microsoft.com/office/word/2023/wordml/word16du" xmlns:w16sdtdh="http://schemas.microsoft.com/office/word/2020/wordml/sdtdatahash" xmlns:w16sdtfl="http://schemas.microsoft.com/office/word/2024/wordml/sdtformatlock" xmlns:w16se="http://schemas.microsoft.com/office/word/2015/wordml/symex" xmlns:wpg="http://schemas.microsoft.com/office/word/2010/wordprocessingGroup" xmlns:wpi="http://schemas.microsoft.com/office/word/2010/wordprocessingInk" xmlns:wne="http://schemas.microsoft.com/office/word/2006/wordml" xmlns:wps="http://schemas.microsoft.com/office/word/2010/wordprocessingShape" mc:Ignorable="w14 w15 w16se w16cid w16 w16cex w16sdtdh w16sdtfl w16du wp14">
   <w:p>
     <w:pPr>
-      <w:pStyle w:val="af4"/>
+      <w:pStyle w:val="Footer"/>
     </w:pPr>
   </w:p>
 </w:ftr>
@@ -1225,7 +1145,7 @@
 <w:ftr xmlns:wpc="http://schemas.microsoft.com/office/word/2010/wordprocessingCanvas" xmlns:cx="http://schemas.microsoft.com/office/drawing/2014/chartex" xmlns:cx1="http://schemas.microsoft.com/office/drawing/2015/9/8/chartex" xmlns:cx2="http://schemas.microsoft.com/office/drawing/2015/10/21/chartex" xmlns:cx3="http://schemas.microsoft.com/office/drawing/2016/5/9/chartex" xmlns:cx4="http://schemas.microsoft.com/office/drawing/2016/5/10/chartex" xmlns:cx5="http://schemas.microsoft.com/office/drawing/2016/5/11/chartex" xmlns:cx6="http://schemas.microsoft.com/office/drawing/2016/5/12/chartex" xmlns:cx7="http://schemas.microsoft.com/office/drawing/2016/5/13/chartex" xmlns:cx8="http://schemas.microsoft.com/office/drawing/2016/5/14/chartex" xmlns:mc="http://schemas.openxmlformats.org/markup-compatibility/2006" xmlns:aink="http://schemas.microsoft.com/office/drawing/2016/ink" xmlns:am3d="http://schemas.microsoft.com/office/drawing/2017/model3d" xmlns:o="urn:schemas-microsoft-com:office:office" xmlns:oel="http://schemas.microsoft.com/office/2019/extlst" xmlns:r="http://schemas.openxmlformats.org/officeDocument/2006/relationships" xmlns:m="http://schemas.openxmlformats.org/officeDocument/2006/math" xmlns:v="urn:schemas-microsoft-com:vml" xmlns:wp14="http://schemas.microsoft.com/office/word/2010/wordprocessingDrawing" xmlns:wp="http://schemas.openxmlformats.org/drawingml/2006/wordprocessingDrawing" xmlns:w10="urn:schemas-microsoft-com:office:word" xmlns:w="http://schemas.openxmlformats.org/wordprocessingml/2006/main" xmlns:w14="http://schemas.microsoft.com/office/word/2010/wordml" xmlns:w15="http://schemas.microsoft.com/office/word/2012/wordml" xmlns:w16cex="http://schemas.microsoft.com/office/word/2018/wordml/cex" xmlns:w16cid="http://schemas.microsoft.com/office/word/2016/wordml/cid" xmlns:w16="http://schemas.microsoft.com/office/word/2018/wordml" xmlns:w16du="http://schemas.microsoft.com/office/word/2023/wordml/word16du" xmlns:w16sdtdh="http://schemas.microsoft.com/office/word/2020/wordml/sdtdatahash" xmlns:w16sdtfl="http://schemas.microsoft.com/office/word/2024/wordml/sdtformatlock" xmlns:w16se="http://schemas.microsoft.com/office/word/2015/wordml/symex" xmlns:wpg="http://schemas.microsoft.com/office/word/2010/wordprocessingGroup" xmlns:wpi="http://schemas.microsoft.com/office/word/2010/wordprocessingInk" xmlns:wne="http://schemas.microsoft.com/office/word/2006/wordml" xmlns:wps="http://schemas.microsoft.com/office/word/2010/wordprocessingShape" mc:Ignorable="w14 w15 w16se w16cid w16 w16cex w16sdtdh w16sdtfl w16du wp14">
   <w:p>
     <w:pPr>
-      <w:pStyle w:val="af4"/>
+      <w:pStyle w:val="Footer"/>
       <w:wordWrap w:val="0"/>
       <w:jc w:val="right"/>
       <w:rPr>
@@ -1234,20 +1154,6 @@
         <w:lang w:eastAsia="zh-CN"/>
       </w:rPr>
     </w:pPr>
-    <w:r>
-      <w:rPr>
-        <w:sz w:val="24"/>
-        <w:szCs w:val="24"/>
-      </w:rPr>
-      <w:t xml:space="preserve">Generated by </w:t>
-    </w:r>
-    <w:r>
-      <w:rPr>
-        <w:sz w:val="24"/>
-        <w:szCs w:val="24"/>
-      </w:rPr>
-      <w:t>Kimi.ai</w:t>
-    </w:r>
   </w:p>
 </w:ftr>
 </file>
@@ -1256,25 +1162,25 @@
 <w:ftr xmlns:wpc="http://schemas.microsoft.com/office/word/2010/wordprocessingCanvas" xmlns:cx="http://schemas.microsoft.com/office/drawing/2014/chartex" xmlns:cx1="http://schemas.microsoft.com/office/drawing/2015/9/8/chartex" xmlns:cx2="http://schemas.microsoft.com/office/drawing/2015/10/21/chartex" xmlns:cx3="http://schemas.microsoft.com/office/drawing/2016/5/9/chartex" xmlns:cx4="http://schemas.microsoft.com/office/drawing/2016/5/10/chartex" xmlns:cx5="http://schemas.microsoft.com/office/drawing/2016/5/11/chartex" xmlns:cx6="http://schemas.microsoft.com/office/drawing/2016/5/12/chartex" xmlns:cx7="http://schemas.microsoft.com/office/drawing/2016/5/13/chartex" xmlns:cx8="http://schemas.microsoft.com/office/drawing/2016/5/14/chartex" xmlns:mc="http://schemas.openxmlformats.org/markup-compatibility/2006" xmlns:aink="http://schemas.microsoft.com/office/drawing/2016/ink" xmlns:am3d="http://schemas.microsoft.com/office/drawing/2017/model3d" xmlns:o="urn:schemas-microsoft-com:office:office" xmlns:oel="http://schemas.microsoft.com/office/2019/extlst" xmlns:r="http://schemas.openxmlformats.org/officeDocument/2006/relationships" xmlns:m="http://schemas.openxmlformats.org/officeDocument/2006/math" xmlns:v="urn:schemas-microsoft-com:vml" xmlns:wp14="http://schemas.microsoft.com/office/word/2010/wordprocessingDrawing" xmlns:wp="http://schemas.openxmlformats.org/drawingml/2006/wordprocessingDrawing" xmlns:w10="urn:schemas-microsoft-com:office:word" xmlns:w="http://schemas.openxmlformats.org/wordprocessingml/2006/main" xmlns:w14="http://schemas.microsoft.com/office/word/2010/wordml" xmlns:w15="http://schemas.microsoft.com/office/word/2012/wordml" xmlns:w16cex="http://schemas.microsoft.com/office/word/2018/wordml/cex" xmlns:w16cid="http://schemas.microsoft.com/office/word/2016/wordml/cid" xmlns:w16="http://schemas.microsoft.com/office/word/2018/wordml" xmlns:w16du="http://schemas.microsoft.com/office/word/2023/wordml/word16du" xmlns:w16sdtdh="http://schemas.microsoft.com/office/word/2020/wordml/sdtdatahash" xmlns:w16sdtfl="http://schemas.microsoft.com/office/word/2024/wordml/sdtformatlock" xmlns:w16se="http://schemas.microsoft.com/office/word/2015/wordml/symex" xmlns:wpg="http://schemas.microsoft.com/office/word/2010/wordprocessingGroup" xmlns:wpi="http://schemas.microsoft.com/office/word/2010/wordprocessingInk" xmlns:wne="http://schemas.microsoft.com/office/word/2006/wordml" xmlns:wps="http://schemas.microsoft.com/office/word/2010/wordprocessingShape" mc:Ignorable="w14 w15 w16se w16cid w16 w16cex w16sdtdh w16sdtfl w16du wp14">
   <w:p>
     <w:pPr>
-      <w:pStyle w:val="af4"/>
+      <w:pStyle w:val="Footer"/>
     </w:pPr>
   </w:p>
 </w:ftr>
 </file>
 
 <file path=word/footnotes.xml><?xml version="1.0" encoding="utf-8"?>
-<w:footnotes xmlns:w="http://schemas.openxmlformats.org/wordprocessingml/2006/main" xmlns:m="http://schemas.openxmlformats.org/officeDocument/2006/math" xmlns:r="http://schemas.openxmlformats.org/officeDocument/2006/relationships" xmlns:o="urn:schemas-microsoft-com:office:office" xmlns:v="urn:schemas-microsoft-com:vml" xmlns:w10="urn:schemas-microsoft-com:office:word" xmlns:a="http://schemas.openxmlformats.org/drawingml/2006/main" xmlns:pic="http://schemas.openxmlformats.org/drawingml/2006/picture" xmlns:wp="http://schemas.openxmlformats.org/drawingml/2006/wordprocessingDrawing">
+<w:footnotes xmlns:wpc="http://schemas.microsoft.com/office/word/2010/wordprocessingCanvas" xmlns:cx="http://schemas.microsoft.com/office/drawing/2014/chartex" xmlns:cx1="http://schemas.microsoft.com/office/drawing/2015/9/8/chartex" xmlns:cx2="http://schemas.microsoft.com/office/drawing/2015/10/21/chartex" xmlns:cx3="http://schemas.microsoft.com/office/drawing/2016/5/9/chartex" xmlns:cx4="http://schemas.microsoft.com/office/drawing/2016/5/10/chartex" xmlns:cx5="http://schemas.microsoft.com/office/drawing/2016/5/11/chartex" xmlns:cx6="http://schemas.microsoft.com/office/drawing/2016/5/12/chartex" xmlns:cx7="http://schemas.microsoft.com/office/drawing/2016/5/13/chartex" xmlns:cx8="http://schemas.microsoft.com/office/drawing/2016/5/14/chartex" xmlns:mc="http://schemas.openxmlformats.org/markup-compatibility/2006" xmlns:aink="http://schemas.microsoft.com/office/drawing/2016/ink" xmlns:am3d="http://schemas.microsoft.com/office/drawing/2017/model3d" xmlns:o="urn:schemas-microsoft-com:office:office" xmlns:oel="http://schemas.microsoft.com/office/2019/extlst" xmlns:r="http://schemas.openxmlformats.org/officeDocument/2006/relationships" xmlns:m="http://schemas.openxmlformats.org/officeDocument/2006/math" xmlns:v="urn:schemas-microsoft-com:vml" xmlns:wp14="http://schemas.microsoft.com/office/word/2010/wordprocessingDrawing" xmlns:wp="http://schemas.openxmlformats.org/drawingml/2006/wordprocessingDrawing" xmlns:w10="urn:schemas-microsoft-com:office:word" xmlns:w="http://schemas.openxmlformats.org/wordprocessingml/2006/main" xmlns:w14="http://schemas.microsoft.com/office/word/2010/wordml" xmlns:w15="http://schemas.microsoft.com/office/word/2012/wordml" xmlns:w16cex="http://schemas.microsoft.com/office/word/2018/wordml/cex" xmlns:w16cid="http://schemas.microsoft.com/office/word/2016/wordml/cid" xmlns:w16="http://schemas.microsoft.com/office/word/2018/wordml" xmlns:w16du="http://schemas.microsoft.com/office/word/2023/wordml/word16du" xmlns:w16sdtdh="http://schemas.microsoft.com/office/word/2020/wordml/sdtdatahash" xmlns:w16sdtfl="http://schemas.microsoft.com/office/word/2024/wordml/sdtformatlock" xmlns:w16se="http://schemas.microsoft.com/office/word/2015/wordml/symex" xmlns:wpg="http://schemas.microsoft.com/office/word/2010/wordprocessingGroup" xmlns:wpi="http://schemas.microsoft.com/office/word/2010/wordprocessingInk" xmlns:wne="http://schemas.microsoft.com/office/word/2006/wordml" xmlns:wps="http://schemas.microsoft.com/office/word/2010/wordprocessingShape" mc:Ignorable="w14 w15 w16se w16cid w16 w16cex w16sdtdh w16sdtfl w16du wp14">
+  <w:footnote w:type="separator" w:id="-1">
+    <w:p>
+      <w:r>
+        <w:separator/>
+      </w:r>
+    </w:p>
+  </w:footnote>
   <w:footnote w:type="continuationSeparator" w:id="0">
     <w:p>
       <w:r>
         <w:continuationSeparator/>
-      </w:r>
-    </w:p>
-  </w:footnote>
-  <w:footnote w:type="separator" w:id="-1">
-    <w:p>
-      <w:r>
-        <w:separator/>
       </w:r>
     </w:p>
   </w:footnote>
@@ -1285,7 +1191,7 @@
 <w:hdr xmlns:wpc="http://schemas.microsoft.com/office/word/2010/wordprocessingCanvas" xmlns:cx="http://schemas.microsoft.com/office/drawing/2014/chartex" xmlns:cx1="http://schemas.microsoft.com/office/drawing/2015/9/8/chartex" xmlns:cx2="http://schemas.microsoft.com/office/drawing/2015/10/21/chartex" xmlns:cx3="http://schemas.microsoft.com/office/drawing/2016/5/9/chartex" xmlns:cx4="http://schemas.microsoft.com/office/drawing/2016/5/10/chartex" xmlns:cx5="http://schemas.microsoft.com/office/drawing/2016/5/11/chartex" xmlns:cx6="http://schemas.microsoft.com/office/drawing/2016/5/12/chartex" xmlns:cx7="http://schemas.microsoft.com/office/drawing/2016/5/13/chartex" xmlns:cx8="http://schemas.microsoft.com/office/drawing/2016/5/14/chartex" xmlns:mc="http://schemas.openxmlformats.org/markup-compatibility/2006" xmlns:aink="http://schemas.microsoft.com/office/drawing/2016/ink" xmlns:am3d="http://schemas.microsoft.com/office/drawing/2017/model3d" xmlns:o="urn:schemas-microsoft-com:office:office" xmlns:oel="http://schemas.microsoft.com/office/2019/extlst" xmlns:r="http://schemas.openxmlformats.org/officeDocument/2006/relationships" xmlns:m="http://schemas.openxmlformats.org/officeDocument/2006/math" xmlns:v="urn:schemas-microsoft-com:vml" xmlns:wp14="http://schemas.microsoft.com/office/word/2010/wordprocessingDrawing" xmlns:wp="http://schemas.openxmlformats.org/drawingml/2006/wordprocessingDrawing" xmlns:w10="urn:schemas-microsoft-com:office:word" xmlns:w="http://schemas.openxmlformats.org/wordprocessingml/2006/main" xmlns:w14="http://schemas.microsoft.com/office/word/2010/wordml" xmlns:w15="http://schemas.microsoft.com/office/word/2012/wordml" xmlns:w16cex="http://schemas.microsoft.com/office/word/2018/wordml/cex" xmlns:w16cid="http://schemas.microsoft.com/office/word/2016/wordml/cid" xmlns:w16="http://schemas.microsoft.com/office/word/2018/wordml" xmlns:w16du="http://schemas.microsoft.com/office/word/2023/wordml/word16du" xmlns:w16sdtdh="http://schemas.microsoft.com/office/word/2020/wordml/sdtdatahash" xmlns:w16sdtfl="http://schemas.microsoft.com/office/word/2024/wordml/sdtformatlock" xmlns:w16se="http://schemas.microsoft.com/office/word/2015/wordml/symex" xmlns:wpg="http://schemas.microsoft.com/office/word/2010/wordprocessingGroup" xmlns:wpi="http://schemas.microsoft.com/office/word/2010/wordprocessingInk" xmlns:wne="http://schemas.microsoft.com/office/word/2006/wordml" xmlns:wps="http://schemas.microsoft.com/office/word/2010/wordprocessingShape" mc:Ignorable="w14 w15 w16se w16cid w16 w16cex w16sdtdh w16sdtfl w16du wp14">
   <w:p>
     <w:pPr>
-      <w:pStyle w:val="af2"/>
+      <w:pStyle w:val="Header"/>
     </w:pPr>
   </w:p>
 </w:hdr>
@@ -1295,7 +1201,7 @@
 <w:hdr xmlns:wpc="http://schemas.microsoft.com/office/word/2010/wordprocessingCanvas" xmlns:cx="http://schemas.microsoft.com/office/drawing/2014/chartex" xmlns:cx1="http://schemas.microsoft.com/office/drawing/2015/9/8/chartex" xmlns:cx2="http://schemas.microsoft.com/office/drawing/2015/10/21/chartex" xmlns:cx3="http://schemas.microsoft.com/office/drawing/2016/5/9/chartex" xmlns:cx4="http://schemas.microsoft.com/office/drawing/2016/5/10/chartex" xmlns:cx5="http://schemas.microsoft.com/office/drawing/2016/5/11/chartex" xmlns:cx6="http://schemas.microsoft.com/office/drawing/2016/5/12/chartex" xmlns:cx7="http://schemas.microsoft.com/office/drawing/2016/5/13/chartex" xmlns:cx8="http://schemas.microsoft.com/office/drawing/2016/5/14/chartex" xmlns:mc="http://schemas.openxmlformats.org/markup-compatibility/2006" xmlns:aink="http://schemas.microsoft.com/office/drawing/2016/ink" xmlns:am3d="http://schemas.microsoft.com/office/drawing/2017/model3d" xmlns:o="urn:schemas-microsoft-com:office:office" xmlns:oel="http://schemas.microsoft.com/office/2019/extlst" xmlns:r="http://schemas.openxmlformats.org/officeDocument/2006/relationships" xmlns:m="http://schemas.openxmlformats.org/officeDocument/2006/math" xmlns:v="urn:schemas-microsoft-com:vml" xmlns:wp14="http://schemas.microsoft.com/office/word/2010/wordprocessingDrawing" xmlns:wp="http://schemas.openxmlformats.org/drawingml/2006/wordprocessingDrawing" xmlns:w10="urn:schemas-microsoft-com:office:word" xmlns:w="http://schemas.openxmlformats.org/wordprocessingml/2006/main" xmlns:w14="http://schemas.microsoft.com/office/word/2010/wordml" xmlns:w15="http://schemas.microsoft.com/office/word/2012/wordml" xmlns:w16cex="http://schemas.microsoft.com/office/word/2018/wordml/cex" xmlns:w16cid="http://schemas.microsoft.com/office/word/2016/wordml/cid" xmlns:w16="http://schemas.microsoft.com/office/word/2018/wordml" xmlns:w16du="http://schemas.microsoft.com/office/word/2023/wordml/word16du" xmlns:w16sdtdh="http://schemas.microsoft.com/office/word/2020/wordml/sdtdatahash" xmlns:w16sdtfl="http://schemas.microsoft.com/office/word/2024/wordml/sdtformatlock" xmlns:w16se="http://schemas.microsoft.com/office/word/2015/wordml/symex" xmlns:wpg="http://schemas.microsoft.com/office/word/2010/wordprocessingGroup" xmlns:wpi="http://schemas.microsoft.com/office/word/2010/wordprocessingInk" xmlns:wne="http://schemas.microsoft.com/office/word/2006/wordml" xmlns:wps="http://schemas.microsoft.com/office/word/2010/wordprocessingShape" mc:Ignorable="w14 w15 w16se w16cid w16 w16cex w16sdtdh w16sdtfl w16du wp14">
   <w:p>
     <w:pPr>
-      <w:pStyle w:val="af2"/>
+      <w:pStyle w:val="Header"/>
     </w:pPr>
   </w:p>
 </w:hdr>
@@ -1305,15 +1211,15 @@
 <w:hdr xmlns:wpc="http://schemas.microsoft.com/office/word/2010/wordprocessingCanvas" xmlns:cx="http://schemas.microsoft.com/office/drawing/2014/chartex" xmlns:cx1="http://schemas.microsoft.com/office/drawing/2015/9/8/chartex" xmlns:cx2="http://schemas.microsoft.com/office/drawing/2015/10/21/chartex" xmlns:cx3="http://schemas.microsoft.com/office/drawing/2016/5/9/chartex" xmlns:cx4="http://schemas.microsoft.com/office/drawing/2016/5/10/chartex" xmlns:cx5="http://schemas.microsoft.com/office/drawing/2016/5/11/chartex" xmlns:cx6="http://schemas.microsoft.com/office/drawing/2016/5/12/chartex" xmlns:cx7="http://schemas.microsoft.com/office/drawing/2016/5/13/chartex" xmlns:cx8="http://schemas.microsoft.com/office/drawing/2016/5/14/chartex" xmlns:mc="http://schemas.openxmlformats.org/markup-compatibility/2006" xmlns:aink="http://schemas.microsoft.com/office/drawing/2016/ink" xmlns:am3d="http://schemas.microsoft.com/office/drawing/2017/model3d" xmlns:o="urn:schemas-microsoft-com:office:office" xmlns:oel="http://schemas.microsoft.com/office/2019/extlst" xmlns:r="http://schemas.openxmlformats.org/officeDocument/2006/relationships" xmlns:m="http://schemas.openxmlformats.org/officeDocument/2006/math" xmlns:v="urn:schemas-microsoft-com:vml" xmlns:wp14="http://schemas.microsoft.com/office/word/2010/wordprocessingDrawing" xmlns:wp="http://schemas.openxmlformats.org/drawingml/2006/wordprocessingDrawing" xmlns:w10="urn:schemas-microsoft-com:office:word" xmlns:w="http://schemas.openxmlformats.org/wordprocessingml/2006/main" xmlns:w14="http://schemas.microsoft.com/office/word/2010/wordml" xmlns:w15="http://schemas.microsoft.com/office/word/2012/wordml" xmlns:w16cex="http://schemas.microsoft.com/office/word/2018/wordml/cex" xmlns:w16cid="http://schemas.microsoft.com/office/word/2016/wordml/cid" xmlns:w16="http://schemas.microsoft.com/office/word/2018/wordml" xmlns:w16du="http://schemas.microsoft.com/office/word/2023/wordml/word16du" xmlns:w16sdtdh="http://schemas.microsoft.com/office/word/2020/wordml/sdtdatahash" xmlns:w16sdtfl="http://schemas.microsoft.com/office/word/2024/wordml/sdtformatlock" xmlns:w16se="http://schemas.microsoft.com/office/word/2015/wordml/symex" xmlns:wpg="http://schemas.microsoft.com/office/word/2010/wordprocessingGroup" xmlns:wpi="http://schemas.microsoft.com/office/word/2010/wordprocessingInk" xmlns:wne="http://schemas.microsoft.com/office/word/2006/wordml" xmlns:wps="http://schemas.microsoft.com/office/word/2010/wordprocessingShape" mc:Ignorable="w14 w15 w16se w16cid w16 w16cex w16sdtdh w16sdtfl w16du wp14">
   <w:p>
     <w:pPr>
-      <w:pStyle w:val="af2"/>
+      <w:pStyle w:val="Header"/>
     </w:pPr>
   </w:p>
 </w:hdr>
 </file>
 
 <file path=word/numbering.xml><?xml version="1.0" encoding="utf-8"?>
-<w:numbering xmlns:aink="http://schemas.microsoft.com/office/drawing/2016/ink" xmlns:am3d="http://schemas.microsoft.com/office/drawing/2017/model3d" xmlns:cx="http://schemas.microsoft.com/office/drawing/2014/chartex" xmlns:cx1="http://schemas.microsoft.com/office/drawing/2015/9/8/chartex" xmlns:cx2="http://schemas.microsoft.com/office/drawing/2015/10/21/chartex" xmlns:cx3="http://schemas.microsoft.com/office/drawing/2016/5/9/chartex" xmlns:cx4="http://schemas.microsoft.com/office/drawing/2016/5/10/chartex" xmlns:cx5="http://schemas.microsoft.com/office/drawing/2016/5/11/chartex" xmlns:cx6="http://schemas.microsoft.com/office/drawing/2016/5/12/chartex" xmlns:cx7="http://schemas.microsoft.com/office/drawing/2016/5/13/chartex" xmlns:cx8="http://schemas.microsoft.com/office/drawing/2016/5/14/chartex" xmlns:m="http://schemas.openxmlformats.org/officeDocument/2006/math" xmlns:mc="http://schemas.openxmlformats.org/markup-compatibility/2006" xmlns:o="urn:schemas-microsoft-com:office:office" xmlns:oel="http://schemas.microsoft.com/office/2019/extlst" xmlns:r="http://schemas.openxmlformats.org/officeDocument/2006/relationships" xmlns:v="urn:schemas-microsoft-com:vml" xmlns:w="http://schemas.openxmlformats.org/wordprocessingml/2006/main" xmlns:w10="urn:schemas-microsoft-com:office:word" xmlns:w14="http://schemas.microsoft.com/office/word/2010/wordml" xmlns:w15="http://schemas.microsoft.com/office/word/2012/wordml" xmlns:w16="http://schemas.microsoft.com/office/word/2018/wordml" xmlns:w16cex="http://schemas.microsoft.com/office/word/2018/wordml/cex" xmlns:w16cid="http://schemas.microsoft.com/office/word/2016/wordml/cid" xmlns:w16du="http://schemas.microsoft.com/office/word/2023/wordml/word16du" xmlns:w16sdtdh="http://schemas.microsoft.com/office/word/2020/wordml/sdtdatahash" xmlns:w16sdtfl="http://schemas.microsoft.com/office/word/2024/wordml/sdtformatlock" xmlns:w16se="http://schemas.microsoft.com/office/word/2015/wordml/symex" xmlns:wne="http://schemas.microsoft.com/office/word/2006/wordml" xmlns:wp="http://schemas.openxmlformats.org/drawingml/2006/wordprocessingDrawing" xmlns:wp14="http://schemas.microsoft.com/office/word/2010/wordprocessingDrawing" xmlns:wpc="http://schemas.microsoft.com/office/word/2010/wordprocessingCanvas" xmlns:wpg="http://schemas.microsoft.com/office/word/2010/wordprocessingGroup" xmlns:wpi="http://schemas.microsoft.com/office/word/2010/wordprocessingInk" xmlns:wps="http://schemas.microsoft.com/office/word/2010/wordprocessingShape" mc:Ignorable="w14 w15 w16se w16cid w16 w16cex w16sdtdh w16sdtfl w16du wp14">
-  <w:abstractNum w15:restartNumberingAfterBreak="0" w:abstractNumId="0">
+<w:numbering xmlns:wpc="http://schemas.microsoft.com/office/word/2010/wordprocessingCanvas" xmlns:cx="http://schemas.microsoft.com/office/drawing/2014/chartex" xmlns:cx1="http://schemas.microsoft.com/office/drawing/2015/9/8/chartex" xmlns:cx2="http://schemas.microsoft.com/office/drawing/2015/10/21/chartex" xmlns:cx3="http://schemas.microsoft.com/office/drawing/2016/5/9/chartex" xmlns:cx4="http://schemas.microsoft.com/office/drawing/2016/5/10/chartex" xmlns:cx5="http://schemas.microsoft.com/office/drawing/2016/5/11/chartex" xmlns:cx6="http://schemas.microsoft.com/office/drawing/2016/5/12/chartex" xmlns:cx7="http://schemas.microsoft.com/office/drawing/2016/5/13/chartex" xmlns:cx8="http://schemas.microsoft.com/office/drawing/2016/5/14/chartex" xmlns:mc="http://schemas.openxmlformats.org/markup-compatibility/2006" xmlns:aink="http://schemas.microsoft.com/office/drawing/2016/ink" xmlns:am3d="http://schemas.microsoft.com/office/drawing/2017/model3d" xmlns:o="urn:schemas-microsoft-com:office:office" xmlns:oel="http://schemas.microsoft.com/office/2019/extlst" xmlns:r="http://schemas.openxmlformats.org/officeDocument/2006/relationships" xmlns:m="http://schemas.openxmlformats.org/officeDocument/2006/math" xmlns:v="urn:schemas-microsoft-com:vml" xmlns:wp14="http://schemas.microsoft.com/office/word/2010/wordprocessingDrawing" xmlns:wp="http://schemas.openxmlformats.org/drawingml/2006/wordprocessingDrawing" xmlns:w10="urn:schemas-microsoft-com:office:word" xmlns:w="http://schemas.openxmlformats.org/wordprocessingml/2006/main" xmlns:w14="http://schemas.microsoft.com/office/word/2010/wordml" xmlns:w15="http://schemas.microsoft.com/office/word/2012/wordml" xmlns:w16cex="http://schemas.microsoft.com/office/word/2018/wordml/cex" xmlns:w16cid="http://schemas.microsoft.com/office/word/2016/wordml/cid" xmlns:w16="http://schemas.microsoft.com/office/word/2018/wordml" xmlns:w16du="http://schemas.microsoft.com/office/word/2023/wordml/word16du" xmlns:w16sdtdh="http://schemas.microsoft.com/office/word/2020/wordml/sdtdatahash" xmlns:w16sdtfl="http://schemas.microsoft.com/office/word/2024/wordml/sdtformatlock" xmlns:w16se="http://schemas.microsoft.com/office/word/2015/wordml/symex" xmlns:wpg="http://schemas.microsoft.com/office/word/2010/wordprocessingGroup" xmlns:wpi="http://schemas.microsoft.com/office/word/2010/wordprocessingInk" xmlns:wne="http://schemas.microsoft.com/office/word/2006/wordml" xmlns:wps="http://schemas.microsoft.com/office/word/2010/wordprocessingShape" mc:Ignorable="w14 w15 w16se w16cid w16 w16cex w16sdtdh w16sdtfl w16du wp14">
+  <w:abstractNum w:abstractNumId="0" w15:restartNumberingAfterBreak="0">
     <w:nsid w:val="FFFFFF7F"/>
     <w:multiLevelType w:val="singleLevel"/>
     <w:tmpl w:val="E34447C8"/>
@@ -1324,13 +1230,13 @@
       <w:lvlJc w:val="left"/>
       <w:pPr>
         <w:tabs>
-          <w:tab w:pos="780" w:val="num"/>
+          <w:tab w:val="num" w:pos="780"/>
         </w:tabs>
-        <w:ind w:hanging="360" w:hangingChars="200" w:left="780" w:leftChars="200"/>
+        <w:ind w:leftChars="200" w:left="780" w:hangingChars="200" w:hanging="360"/>
       </w:pPr>
     </w:lvl>
   </w:abstractNum>
-  <w:abstractNum w15:restartNumberingAfterBreak="0" w:abstractNumId="1">
+  <w:abstractNum w:abstractNumId="1" w15:restartNumberingAfterBreak="0">
     <w:nsid w:val="FFFFFF88"/>
     <w:multiLevelType w:val="singleLevel"/>
     <w:tmpl w:val="FBEE7FC8"/>
@@ -1341,13 +1247,167 @@
       <w:lvlJc w:val="left"/>
       <w:pPr>
         <w:tabs>
-          <w:tab w:pos="360" w:val="num"/>
+          <w:tab w:val="num" w:pos="360"/>
         </w:tabs>
-        <w:ind w:hanging="360" w:hangingChars="200" w:left="360"/>
+        <w:ind w:left="360" w:hangingChars="200" w:hanging="360"/>
       </w:pPr>
     </w:lvl>
   </w:abstractNum>
-  <w:abstractNum w15:restartNumberingAfterBreak="0" w:abstractNumId="2">
+  <w:abstractNum w:abstractNumId="2" w15:restartNumberingAfterBreak="0">
+    <w:nsid w:val="0000A990"/>
+    <w:multiLevelType w:val="multilevel"/>
+    <w:tmpl w:val="C8586CFA"/>
+    <w:lvl w:ilvl="0">
+      <w:numFmt w:val="bullet"/>
+      <w:lvlText w:val=" "/>
+      <w:lvlJc w:val="left"/>
+      <w:pPr>
+        <w:ind w:left="720" w:hanging="480"/>
+      </w:pPr>
+    </w:lvl>
+    <w:lvl w:ilvl="1">
+      <w:numFmt w:val="bullet"/>
+      <w:lvlText w:val=" "/>
+      <w:lvlJc w:val="left"/>
+      <w:pPr>
+        <w:ind w:left="1440" w:hanging="480"/>
+      </w:pPr>
+    </w:lvl>
+    <w:lvl w:ilvl="2">
+      <w:numFmt w:val="bullet"/>
+      <w:lvlText w:val=" "/>
+      <w:lvlJc w:val="left"/>
+      <w:pPr>
+        <w:ind w:left="2160" w:hanging="480"/>
+      </w:pPr>
+    </w:lvl>
+    <w:lvl w:ilvl="3">
+      <w:numFmt w:val="bullet"/>
+      <w:lvlText w:val=" "/>
+      <w:lvlJc w:val="left"/>
+      <w:pPr>
+        <w:ind w:left="2880" w:hanging="480"/>
+      </w:pPr>
+    </w:lvl>
+    <w:lvl w:ilvl="4">
+      <w:numFmt w:val="bullet"/>
+      <w:lvlText w:val=" "/>
+      <w:lvlJc w:val="left"/>
+      <w:pPr>
+        <w:ind w:left="3600" w:hanging="480"/>
+      </w:pPr>
+    </w:lvl>
+    <w:lvl w:ilvl="5">
+      <w:numFmt w:val="bullet"/>
+      <w:lvlText w:val=" "/>
+      <w:lvlJc w:val="left"/>
+      <w:pPr>
+        <w:ind w:left="4320" w:hanging="480"/>
+      </w:pPr>
+    </w:lvl>
+    <w:lvl w:ilvl="6">
+      <w:numFmt w:val="bullet"/>
+      <w:lvlText w:val=" "/>
+      <w:lvlJc w:val="left"/>
+      <w:pPr>
+        <w:ind w:left="5040" w:hanging="480"/>
+      </w:pPr>
+    </w:lvl>
+    <w:lvl w:ilvl="7">
+      <w:numFmt w:val="bullet"/>
+      <w:lvlText w:val=" "/>
+      <w:lvlJc w:val="left"/>
+      <w:pPr>
+        <w:ind w:left="5760" w:hanging="480"/>
+      </w:pPr>
+    </w:lvl>
+    <w:lvl w:ilvl="8">
+      <w:numFmt w:val="bullet"/>
+      <w:lvlText w:val=" "/>
+      <w:lvlJc w:val="left"/>
+      <w:pPr>
+        <w:ind w:left="6480" w:hanging="480"/>
+      </w:pPr>
+    </w:lvl>
+  </w:abstractNum>
+  <w:abstractNum w:abstractNumId="3" w15:restartNumberingAfterBreak="0">
+    <w:nsid w:val="0000A991"/>
+    <w:multiLevelType w:val="multilevel"/>
+    <w:tmpl w:val="602CFA5A"/>
+    <w:lvl w:ilvl="0">
+      <w:numFmt w:val="bullet"/>
+      <w:lvlText w:val="•"/>
+      <w:lvlJc w:val="left"/>
+      <w:pPr>
+        <w:ind w:left="720" w:hanging="480"/>
+      </w:pPr>
+    </w:lvl>
+    <w:lvl w:ilvl="1">
+      <w:numFmt w:val="bullet"/>
+      <w:lvlText w:val="–"/>
+      <w:lvlJc w:val="left"/>
+      <w:pPr>
+        <w:ind w:left="1440" w:hanging="480"/>
+      </w:pPr>
+    </w:lvl>
+    <w:lvl w:ilvl="2">
+      <w:numFmt w:val="bullet"/>
+      <w:lvlText w:val="•"/>
+      <w:lvlJc w:val="left"/>
+      <w:pPr>
+        <w:ind w:left="2160" w:hanging="480"/>
+      </w:pPr>
+    </w:lvl>
+    <w:lvl w:ilvl="3">
+      <w:numFmt w:val="bullet"/>
+      <w:lvlText w:val="–"/>
+      <w:lvlJc w:val="left"/>
+      <w:pPr>
+        <w:ind w:left="2880" w:hanging="480"/>
+      </w:pPr>
+    </w:lvl>
+    <w:lvl w:ilvl="4">
+      <w:numFmt w:val="bullet"/>
+      <w:lvlText w:val="•"/>
+      <w:lvlJc w:val="left"/>
+      <w:pPr>
+        <w:ind w:left="3600" w:hanging="480"/>
+      </w:pPr>
+    </w:lvl>
+    <w:lvl w:ilvl="5">
+      <w:numFmt w:val="bullet"/>
+      <w:lvlText w:val="–"/>
+      <w:lvlJc w:val="left"/>
+      <w:pPr>
+        <w:ind w:left="4320" w:hanging="480"/>
+      </w:pPr>
+    </w:lvl>
+    <w:lvl w:ilvl="6">
+      <w:numFmt w:val="bullet"/>
+      <w:lvlText w:val="•"/>
+      <w:lvlJc w:val="left"/>
+      <w:pPr>
+        <w:ind w:left="5040" w:hanging="480"/>
+      </w:pPr>
+    </w:lvl>
+    <w:lvl w:ilvl="7">
+      <w:numFmt w:val="bullet"/>
+      <w:lvlText w:val="–"/>
+      <w:lvlJc w:val="left"/>
+      <w:pPr>
+        <w:ind w:left="5760" w:hanging="480"/>
+      </w:pPr>
+    </w:lvl>
+    <w:lvl w:ilvl="8">
+      <w:numFmt w:val="bullet"/>
+      <w:lvlText w:val="•"/>
+      <w:lvlJc w:val="left"/>
+      <w:pPr>
+        <w:ind w:left="6480" w:hanging="480"/>
+      </w:pPr>
+    </w:lvl>
+  </w:abstractNum>
+  <w:abstractNum w:abstractNumId="4" w15:restartNumberingAfterBreak="0">
     <w:nsid w:val="170CD2DE"/>
     <w:multiLevelType w:val="multilevel"/>
     <w:tmpl w:val="76E495AA"/>
@@ -1357,9 +1417,9 @@
       <w:lvlJc w:val="left"/>
       <w:pPr>
         <w:tabs>
-          <w:tab w:pos="0" w:val="num"/>
+          <w:tab w:val="num" w:pos="0"/>
         </w:tabs>
-        <w:ind w:hanging="480" w:left="480"/>
+        <w:ind w:left="480" w:hanging="480"/>
       </w:pPr>
     </w:lvl>
     <w:lvl w:ilvl="1">
@@ -1368,9 +1428,9 @@
       <w:lvlJc w:val="left"/>
       <w:pPr>
         <w:tabs>
-          <w:tab w:pos="720" w:val="num"/>
+          <w:tab w:val="num" w:pos="720"/>
         </w:tabs>
-        <w:ind w:hanging="480" w:left="1200"/>
+        <w:ind w:left="1200" w:hanging="480"/>
       </w:pPr>
     </w:lvl>
     <w:lvl w:ilvl="2">
@@ -1379,9 +1439,9 @@
       <w:lvlJc w:val="left"/>
       <w:pPr>
         <w:tabs>
-          <w:tab w:pos="1440" w:val="num"/>
+          <w:tab w:val="num" w:pos="1440"/>
         </w:tabs>
-        <w:ind w:hanging="480" w:left="1920"/>
+        <w:ind w:left="1920" w:hanging="480"/>
       </w:pPr>
     </w:lvl>
     <w:lvl w:ilvl="3">
@@ -1390,9 +1450,9 @@
       <w:lvlJc w:val="left"/>
       <w:pPr>
         <w:tabs>
-          <w:tab w:pos="2160" w:val="num"/>
+          <w:tab w:val="num" w:pos="2160"/>
         </w:tabs>
-        <w:ind w:hanging="480" w:left="2640"/>
+        <w:ind w:left="2640" w:hanging="480"/>
       </w:pPr>
     </w:lvl>
     <w:lvl w:ilvl="4">
@@ -1401,9 +1461,9 @@
       <w:lvlJc w:val="left"/>
       <w:pPr>
         <w:tabs>
-          <w:tab w:pos="2880" w:val="num"/>
+          <w:tab w:val="num" w:pos="2880"/>
         </w:tabs>
-        <w:ind w:hanging="480" w:left="3360"/>
+        <w:ind w:left="3360" w:hanging="480"/>
       </w:pPr>
     </w:lvl>
     <w:lvl w:ilvl="5">
@@ -1412,9 +1472,9 @@
       <w:lvlJc w:val="left"/>
       <w:pPr>
         <w:tabs>
-          <w:tab w:pos="3600" w:val="num"/>
+          <w:tab w:val="num" w:pos="3600"/>
         </w:tabs>
-        <w:ind w:hanging="480" w:left="4080"/>
+        <w:ind w:left="4080" w:hanging="480"/>
       </w:pPr>
     </w:lvl>
     <w:lvl w:ilvl="6">
@@ -1423,9 +1483,9 @@
       <w:lvlJc w:val="left"/>
       <w:pPr>
         <w:tabs>
-          <w:tab w:pos="4320" w:val="num"/>
+          <w:tab w:val="num" w:pos="4320"/>
         </w:tabs>
-        <w:ind w:hanging="480" w:left="4800"/>
+        <w:ind w:left="4800" w:hanging="480"/>
       </w:pPr>
     </w:lvl>
     <w:lvl w:ilvl="7">
@@ -1434,9 +1494,9 @@
       <w:lvlJc w:val="left"/>
       <w:pPr>
         <w:tabs>
-          <w:tab w:pos="5040" w:val="num"/>
+          <w:tab w:val="num" w:pos="5040"/>
         </w:tabs>
-        <w:ind w:hanging="480" w:left="5520"/>
+        <w:ind w:left="5520" w:hanging="480"/>
       </w:pPr>
     </w:lvl>
     <w:lvl w:ilvl="8">
@@ -1445,218 +1505,66 @@
       <w:lvlJc w:val="left"/>
       <w:pPr>
         <w:tabs>
-          <w:tab w:pos="5760" w:val="num"/>
+          <w:tab w:val="num" w:pos="5760"/>
         </w:tabs>
-        <w:ind w:hanging="480" w:left="6240"/>
+        <w:ind w:left="6240" w:hanging="480"/>
       </w:pPr>
     </w:lvl>
   </w:abstractNum>
-  <w:abstractNum w:abstractNumId="990">
-    <w:nsid w:val="0000A990"/>
-    <w:multiLevelType w:val="multilevel"/>
-    <w:lvl w:ilvl="0">
-      <w:numFmt w:val="bullet"/>
-      <w:lvlText w:val=" "/>
-      <w:lvlJc w:val="left"/>
-      <w:pPr>
-        <w:ind w:left="720" w:hanging="480"/>
-      </w:pPr>
-    </w:lvl>
-    <w:lvl w:ilvl="1">
-      <w:numFmt w:val="bullet"/>
-      <w:lvlText w:val=" "/>
-      <w:lvlJc w:val="left"/>
-      <w:pPr>
-        <w:ind w:left="1440" w:hanging="480"/>
-      </w:pPr>
-    </w:lvl>
-    <w:lvl w:ilvl="2">
-      <w:numFmt w:val="bullet"/>
-      <w:lvlText w:val=" "/>
-      <w:lvlJc w:val="left"/>
-      <w:pPr>
-        <w:ind w:left="2160" w:hanging="480"/>
-      </w:pPr>
-    </w:lvl>
-    <w:lvl w:ilvl="3">
-      <w:numFmt w:val="bullet"/>
-      <w:lvlText w:val=" "/>
-      <w:lvlJc w:val="left"/>
-      <w:pPr>
-        <w:ind w:left="2880" w:hanging="480"/>
-      </w:pPr>
-    </w:lvl>
-    <w:lvl w:ilvl="4">
-      <w:numFmt w:val="bullet"/>
-      <w:lvlText w:val=" "/>
-      <w:lvlJc w:val="left"/>
-      <w:pPr>
-        <w:ind w:left="3600" w:hanging="480"/>
-      </w:pPr>
-    </w:lvl>
-    <w:lvl w:ilvl="5">
-      <w:numFmt w:val="bullet"/>
-      <w:lvlText w:val=" "/>
-      <w:lvlJc w:val="left"/>
-      <w:pPr>
-        <w:ind w:left="4320" w:hanging="480"/>
-      </w:pPr>
-    </w:lvl>
-    <w:lvl w:ilvl="6">
-      <w:numFmt w:val="bullet"/>
-      <w:lvlText w:val=" "/>
-      <w:lvlJc w:val="left"/>
-      <w:pPr>
-        <w:ind w:left="5040" w:hanging="480"/>
-      </w:pPr>
-    </w:lvl>
-    <w:lvl w:ilvl="7">
-      <w:numFmt w:val="bullet"/>
-      <w:lvlText w:val=" "/>
-      <w:lvlJc w:val="left"/>
-      <w:pPr>
-        <w:ind w:left="5760" w:hanging="480"/>
-      </w:pPr>
-    </w:lvl>
-    <w:lvl w:ilvl="8">
-      <w:numFmt w:val="bullet"/>
-      <w:lvlText w:val=" "/>
-      <w:lvlJc w:val="left"/>
-      <w:pPr>
-        <w:ind w:left="6480" w:hanging="480"/>
-      </w:pPr>
-    </w:lvl>
-  </w:abstractNum>
-  <w:abstractNum w:abstractNumId="991">
-    <w:nsid w:val="0000A991"/>
-    <w:multiLevelType w:val="multilevel"/>
-    <w:lvl w:ilvl="0">
-      <w:numFmt w:val="bullet"/>
-      <w:lvlText w:val="•"/>
-      <w:lvlJc w:val="left"/>
-      <w:pPr>
-        <w:ind w:left="720" w:hanging="480"/>
-      </w:pPr>
-    </w:lvl>
-    <w:lvl w:ilvl="1">
-      <w:numFmt w:val="bullet"/>
-      <w:lvlText w:val="–"/>
-      <w:lvlJc w:val="left"/>
-      <w:pPr>
-        <w:ind w:left="1440" w:hanging="480"/>
-      </w:pPr>
-    </w:lvl>
-    <w:lvl w:ilvl="2">
-      <w:numFmt w:val="bullet"/>
-      <w:lvlText w:val="•"/>
-      <w:lvlJc w:val="left"/>
-      <w:pPr>
-        <w:ind w:left="2160" w:hanging="480"/>
-      </w:pPr>
-    </w:lvl>
-    <w:lvl w:ilvl="3">
-      <w:numFmt w:val="bullet"/>
-      <w:lvlText w:val="–"/>
-      <w:lvlJc w:val="left"/>
-      <w:pPr>
-        <w:ind w:left="2880" w:hanging="480"/>
-      </w:pPr>
-    </w:lvl>
-    <w:lvl w:ilvl="4">
-      <w:numFmt w:val="bullet"/>
-      <w:lvlText w:val="•"/>
-      <w:lvlJc w:val="left"/>
-      <w:pPr>
-        <w:ind w:left="3600" w:hanging="480"/>
-      </w:pPr>
-    </w:lvl>
-    <w:lvl w:ilvl="5">
-      <w:numFmt w:val="bullet"/>
-      <w:lvlText w:val="–"/>
-      <w:lvlJc w:val="left"/>
-      <w:pPr>
-        <w:ind w:left="4320" w:hanging="480"/>
-      </w:pPr>
-    </w:lvl>
-    <w:lvl w:ilvl="6">
-      <w:numFmt w:val="bullet"/>
-      <w:lvlText w:val="•"/>
-      <w:lvlJc w:val="left"/>
-      <w:pPr>
-        <w:ind w:left="5040" w:hanging="480"/>
-      </w:pPr>
-    </w:lvl>
-    <w:lvl w:ilvl="7">
-      <w:numFmt w:val="bullet"/>
-      <w:lvlText w:val="–"/>
-      <w:lvlJc w:val="left"/>
-      <w:pPr>
-        <w:ind w:left="5760" w:hanging="480"/>
-      </w:pPr>
-    </w:lvl>
-    <w:lvl w:ilvl="8">
-      <w:numFmt w:val="bullet"/>
-      <w:lvlText w:val="•"/>
-      <w:lvlJc w:val="left"/>
-      <w:pPr>
-        <w:ind w:left="6480" w:hanging="480"/>
-      </w:pPr>
-    </w:lvl>
-  </w:abstractNum>
-  <w:num w16cid:durableId="518012929" w:numId="1">
+  <w:num w:numId="1" w16cid:durableId="518012929">
+    <w:abstractNumId w:val="4"/>
+  </w:num>
+  <w:num w:numId="2" w16cid:durableId="1115832812">
+    <w:abstractNumId w:val="0"/>
+  </w:num>
+  <w:num w:numId="3" w16cid:durableId="1385718346">
+    <w:abstractNumId w:val="0"/>
+  </w:num>
+  <w:num w:numId="4" w16cid:durableId="534512707">
+    <w:abstractNumId w:val="0"/>
+  </w:num>
+  <w:num w:numId="5" w16cid:durableId="1318798893">
+    <w:abstractNumId w:val="0"/>
+  </w:num>
+  <w:num w:numId="6" w16cid:durableId="1801877254">
+    <w:abstractNumId w:val="0"/>
+  </w:num>
+  <w:num w:numId="7" w16cid:durableId="295257330">
+    <w:abstractNumId w:val="1"/>
+  </w:num>
+  <w:num w:numId="8" w16cid:durableId="2013414762">
+    <w:abstractNumId w:val="1"/>
+  </w:num>
+  <w:num w:numId="9" w16cid:durableId="815605401">
+    <w:abstractNumId w:val="1"/>
+  </w:num>
+  <w:num w:numId="10" w16cid:durableId="575365733">
+    <w:abstractNumId w:val="1"/>
+  </w:num>
+  <w:num w:numId="11" w16cid:durableId="1047485990">
     <w:abstractNumId w:val="2"/>
   </w:num>
-  <w:num w16cid:durableId="1115832812" w:numId="2">
-    <w:abstractNumId w:val="0"/>
+  <w:num w:numId="12" w16cid:durableId="63989164">
+    <w:abstractNumId w:val="3"/>
   </w:num>
-  <w:num w16cid:durableId="1385718346" w:numId="3">
-    <w:abstractNumId w:val="0"/>
+  <w:num w:numId="13" w16cid:durableId="1298293275">
+    <w:abstractNumId w:val="3"/>
   </w:num>
-  <w:num w16cid:durableId="534512707" w:numId="4">
-    <w:abstractNumId w:val="0"/>
-  </w:num>
-  <w:num w16cid:durableId="1318798893" w:numId="5">
-    <w:abstractNumId w:val="0"/>
-  </w:num>
-  <w:num w16cid:durableId="1801877254" w:numId="6">
-    <w:abstractNumId w:val="0"/>
-  </w:num>
-  <w:num w16cid:durableId="295257330" w:numId="7">
-    <w:abstractNumId w:val="1"/>
-  </w:num>
-  <w:num w16cid:durableId="2013414762" w:numId="8">
-    <w:abstractNumId w:val="1"/>
-  </w:num>
-  <w:num w16cid:durableId="815605401" w:numId="9">
-    <w:abstractNumId w:val="1"/>
-  </w:num>
-  <w:num w16cid:durableId="575365733" w:numId="10">
-    <w:abstractNumId w:val="1"/>
-  </w:num>
-  <w:num w:numId="1000">
-    <w:abstractNumId w:val="990"/>
-  </w:num>
-  <w:num w:numId="1001">
-    <w:abstractNumId w:val="991"/>
-  </w:num>
-  <w:num w:numId="1002">
-    <w:abstractNumId w:val="991"/>
-  </w:num>
-  <w:num w:numId="1003">
-    <w:abstractNumId w:val="991"/>
+  <w:num w:numId="14" w16cid:durableId="1081831310">
+    <w:abstractNumId w:val="3"/>
   </w:num>
 </w:numbering>
 </file>
 
 <file path=word/styles.xml><?xml version="1.0" encoding="utf-8"?>
-<w:styles xmlns:mc="http://schemas.openxmlformats.org/markup-compatibility/2006" xmlns:r="http://schemas.openxmlformats.org/officeDocument/2006/relationships" xmlns:w="http://schemas.openxmlformats.org/wordprocessingml/2006/main" xmlns:w14="http://schemas.microsoft.com/office/word/2010/wordml" xmlns:w15="http://schemas.microsoft.com/office/word/2012/wordml" xmlns:w16="http://schemas.microsoft.com/office/word/2018/wordml" xmlns:w16cex="http://schemas.microsoft.com/office/word/2018/wordml/cex" xmlns:w16cid="http://schemas.microsoft.com/office/word/2016/wordml/cid" xmlns:w16du="http://schemas.microsoft.com/office/word/2023/wordml/word16du" xmlns:w16sdtdh="http://schemas.microsoft.com/office/word/2020/wordml/sdtdatahash" xmlns:w16sdtfl="http://schemas.microsoft.com/office/word/2024/wordml/sdtformatlock" xmlns:w16se="http://schemas.microsoft.com/office/word/2015/wordml/symex" mc:Ignorable="w14 w15 w16se w16cid w16 w16cex w16sdtdh w16sdtfl w16du">
+<w:styles xmlns:mc="http://schemas.openxmlformats.org/markup-compatibility/2006" xmlns:r="http://schemas.openxmlformats.org/officeDocument/2006/relationships" xmlns:w="http://schemas.openxmlformats.org/wordprocessingml/2006/main" xmlns:w14="http://schemas.microsoft.com/office/word/2010/wordml" xmlns:w15="http://schemas.microsoft.com/office/word/2012/wordml" xmlns:w16cex="http://schemas.microsoft.com/office/word/2018/wordml/cex" xmlns:w16cid="http://schemas.microsoft.com/office/word/2016/wordml/cid" xmlns:w16="http://schemas.microsoft.com/office/word/2018/wordml" xmlns:w16du="http://schemas.microsoft.com/office/word/2023/wordml/word16du" xmlns:w16sdtdh="http://schemas.microsoft.com/office/word/2020/wordml/sdtdatahash" xmlns:w16sdtfl="http://schemas.microsoft.com/office/word/2024/wordml/sdtformatlock" xmlns:w16se="http://schemas.microsoft.com/office/word/2015/wordml/symex" mc:Ignorable="w14 w15 w16se w16cid w16 w16cex w16sdtdh w16sdtfl w16du">
   <w:docDefaults>
     <w:rPrDefault>
       <w:rPr>
-        <w:rFonts w:asciiTheme="minorHAnsi" w:cstheme="minorBidi" w:eastAsiaTheme="minorEastAsia" w:hAnsiTheme="minorHAnsi"/>
+        <w:rFonts w:asciiTheme="minorHAnsi" w:eastAsiaTheme="minorEastAsia" w:hAnsiTheme="minorHAnsi" w:cstheme="minorBidi"/>
         <w:sz w:val="24"/>
         <w:szCs w:val="24"/>
-        <w:lang w:bidi="ar-SA" w:eastAsia="en-US" w:val="en-US"/>
+        <w:lang w:val="en-US" w:eastAsia="en-US" w:bidi="ar-SA"/>
       </w:rPr>
     </w:rPrDefault>
     <w:pPrDefault>
@@ -1665,7 +1573,7 @@
       </w:pPr>
     </w:pPrDefault>
   </w:docDefaults>
-  <w:latentStyles w:count="376" w:defLockedState="0" w:defQFormat="0" w:defSemiHidden="0" w:defUIPriority="0" w:defUnhideWhenUsed="0">
+  <w:latentStyles w:defLockedState="0" w:defUIPriority="0" w:defSemiHidden="0" w:defUnhideWhenUsed="0" w:defQFormat="0" w:count="376">
     <w:lsdException w:name="Normal Table" w:semiHidden="1" w:unhideWhenUsed="1"/>
     <w:lsdException w:name="Table Simple 1" w:semiHidden="1" w:unhideWhenUsed="1"/>
     <w:lsdException w:name="Table Simple 2" w:semiHidden="1" w:unhideWhenUsed="1"/>
@@ -1909,7 +1817,7 @@
     <w:lsdException w:name="Unresolved Mention" w:semiHidden="1" w:uiPriority="99" w:unhideWhenUsed="1"/>
     <w:lsdException w:name="Smart Link" w:semiHidden="1" w:uiPriority="99" w:unhideWhenUsed="1"/>
   </w:latentStyles>
-  <w:style w:default="1" w:styleId="a" w:type="paragraph">
+  <w:style w:type="paragraph" w:default="1" w:styleId="Normal">
     <w:name w:val="Normal"/>
     <w:qFormat/>
     <w:rsid w:val="00977478"/>
@@ -1917,14 +1825,14 @@
       <w:spacing w:after="0" w:line="360" w:lineRule="auto"/>
     </w:pPr>
     <w:rPr>
-      <w:rFonts w:ascii="Arial" w:cs="Times New Roman (正文 CS 字体)" w:eastAsia="宋体" w:hAnsi="Arial"/>
-    </w:rPr>
-  </w:style>
-  <w:style w:styleId="1" w:type="paragraph">
+      <w:rFonts w:ascii="Arial" w:eastAsia="SimSun" w:hAnsi="Arial" w:cs="Times New Roman (正文 CS 字体)"/>
+    </w:rPr>
+  </w:style>
+  <w:style w:type="paragraph" w:styleId="Heading1">
     <w:name w:val="heading 1"/>
-    <w:basedOn w:val="a"/>
-    <w:next w:val="a0"/>
-    <w:link w:val="10"/>
+    <w:basedOn w:val="Normal"/>
+    <w:next w:val="BodyText"/>
+    <w:link w:val="Heading1Char"/>
     <w:uiPriority w:val="9"/>
     <w:qFormat/>
     <w:rsid w:val="008708D9"/>
@@ -1934,16 +1842,16 @@
       <w:outlineLvl w:val="0"/>
     </w:pPr>
     <w:rPr>
-      <w:rFonts w:cs="Times New Roman (标题 CS)" w:eastAsia="黑体"/>
+      <w:rFonts w:eastAsia="SimHei" w:cs="Times New Roman (标题 CS)"/>
       <w:sz w:val="30"/>
       <w:szCs w:val="40"/>
     </w:rPr>
   </w:style>
-  <w:style w:styleId="2" w:type="paragraph">
+  <w:style w:type="paragraph" w:styleId="Heading2">
     <w:name w:val="heading 2"/>
-    <w:basedOn w:val="a"/>
-    <w:next w:val="a0"/>
-    <w:link w:val="20"/>
+    <w:basedOn w:val="Normal"/>
+    <w:next w:val="BodyText"/>
+    <w:link w:val="Heading2Char"/>
     <w:uiPriority w:val="9"/>
     <w:semiHidden/>
     <w:unhideWhenUsed/>
@@ -1955,16 +1863,16 @@
       <w:outlineLvl w:val="1"/>
     </w:pPr>
     <w:rPr>
-      <w:rFonts w:cs="Times New Roman (标题 CS)" w:eastAsia="黑体"/>
+      <w:rFonts w:eastAsia="SimHei" w:cs="Times New Roman (标题 CS)"/>
       <w:sz w:val="28"/>
       <w:szCs w:val="32"/>
     </w:rPr>
   </w:style>
-  <w:style w:styleId="3" w:type="paragraph">
+  <w:style w:type="paragraph" w:styleId="Heading3">
     <w:name w:val="heading 3"/>
-    <w:basedOn w:val="a"/>
-    <w:next w:val="a0"/>
-    <w:link w:val="30"/>
+    <w:basedOn w:val="Normal"/>
+    <w:next w:val="BodyText"/>
+    <w:link w:val="Heading3Char"/>
     <w:uiPriority w:val="9"/>
     <w:semiHidden/>
     <w:unhideWhenUsed/>
@@ -1976,16 +1884,16 @@
       <w:outlineLvl w:val="2"/>
     </w:pPr>
     <w:rPr>
-      <w:rFonts w:cs="Times New Roman (标题 CS)" w:eastAsia="黑体"/>
+      <w:rFonts w:eastAsia="SimHei" w:cs="Times New Roman (标题 CS)"/>
       <w:sz w:val="26"/>
       <w:szCs w:val="28"/>
     </w:rPr>
   </w:style>
-  <w:style w:styleId="4" w:type="paragraph">
+  <w:style w:type="paragraph" w:styleId="Heading4">
     <w:name w:val="heading 4"/>
-    <w:basedOn w:val="3"/>
-    <w:next w:val="a0"/>
-    <w:link w:val="40"/>
+    <w:basedOn w:val="Heading3"/>
+    <w:next w:val="BodyText"/>
+    <w:link w:val="Heading4Char"/>
     <w:uiPriority w:val="9"/>
     <w:unhideWhenUsed/>
     <w:qFormat/>
@@ -1994,11 +1902,11 @@
       <w:outlineLvl w:val="3"/>
     </w:pPr>
   </w:style>
-  <w:style w:styleId="5" w:type="paragraph">
+  <w:style w:type="paragraph" w:styleId="Heading5">
     <w:name w:val="heading 5"/>
-    <w:basedOn w:val="4"/>
-    <w:next w:val="a0"/>
-    <w:link w:val="50"/>
+    <w:basedOn w:val="Heading4"/>
+    <w:next w:val="BodyText"/>
+    <w:link w:val="Heading5Char"/>
     <w:uiPriority w:val="9"/>
     <w:unhideWhenUsed/>
     <w:qFormat/>
@@ -2007,11 +1915,11 @@
       <w:outlineLvl w:val="4"/>
     </w:pPr>
   </w:style>
-  <w:style w:styleId="6" w:type="paragraph">
+  <w:style w:type="paragraph" w:styleId="Heading6">
     <w:name w:val="heading 6"/>
-    <w:basedOn w:val="5"/>
-    <w:next w:val="a0"/>
-    <w:link w:val="60"/>
+    <w:basedOn w:val="Heading5"/>
+    <w:next w:val="BodyText"/>
+    <w:link w:val="Heading6Char"/>
     <w:uiPriority w:val="9"/>
     <w:unhideWhenUsed/>
     <w:qFormat/>
@@ -2020,11 +1928,11 @@
       <w:outlineLvl w:val="5"/>
     </w:pPr>
   </w:style>
-  <w:style w:styleId="7" w:type="paragraph">
+  <w:style w:type="paragraph" w:styleId="Heading7">
     <w:name w:val="heading 7"/>
-    <w:basedOn w:val="6"/>
-    <w:next w:val="a0"/>
-    <w:link w:val="70"/>
+    <w:basedOn w:val="Heading6"/>
+    <w:next w:val="BodyText"/>
+    <w:link w:val="Heading7Char"/>
     <w:uiPriority w:val="9"/>
     <w:unhideWhenUsed/>
     <w:qFormat/>
@@ -2033,11 +1941,11 @@
       <w:outlineLvl w:val="6"/>
     </w:pPr>
   </w:style>
-  <w:style w:styleId="8" w:type="paragraph">
+  <w:style w:type="paragraph" w:styleId="Heading8">
     <w:name w:val="heading 8"/>
-    <w:basedOn w:val="7"/>
-    <w:next w:val="a0"/>
-    <w:link w:val="80"/>
+    <w:basedOn w:val="Heading7"/>
+    <w:next w:val="BodyText"/>
+    <w:link w:val="Heading8Char"/>
     <w:uiPriority w:val="9"/>
     <w:unhideWhenUsed/>
     <w:qFormat/>
@@ -2046,11 +1954,11 @@
       <w:outlineLvl w:val="7"/>
     </w:pPr>
   </w:style>
-  <w:style w:styleId="9" w:type="paragraph">
+  <w:style w:type="paragraph" w:styleId="Heading9">
     <w:name w:val="heading 9"/>
-    <w:basedOn w:val="8"/>
-    <w:next w:val="a0"/>
-    <w:link w:val="90"/>
+    <w:basedOn w:val="Heading8"/>
+    <w:next w:val="BodyText"/>
+    <w:link w:val="Heading9Char"/>
     <w:uiPriority w:val="9"/>
     <w:unhideWhenUsed/>
     <w:qFormat/>
@@ -2059,58 +1967,58 @@
       <w:outlineLvl w:val="8"/>
     </w:pPr>
   </w:style>
-  <w:style w:default="1" w:styleId="a1" w:type="character">
+  <w:style w:type="character" w:default="1" w:styleId="DefaultParagraphFont">
     <w:name w:val="Default Paragraph Font"/>
     <w:uiPriority w:val="1"/>
     <w:semiHidden/>
     <w:unhideWhenUsed/>
   </w:style>
-  <w:style w:default="1" w:styleId="a2" w:type="table">
+  <w:style w:type="table" w:default="1" w:styleId="TableNormal">
     <w:name w:val="Normal Table"/>
     <w:uiPriority w:val="99"/>
     <w:semiHidden/>
     <w:unhideWhenUsed/>
     <w:tblPr>
-      <w:tblInd w:type="dxa" w:w="0"/>
+      <w:tblInd w:w="0" w:type="dxa"/>
       <w:tblCellMar>
-        <w:top w:type="dxa" w:w="0"/>
-        <w:left w:type="dxa" w:w="108"/>
-        <w:bottom w:type="dxa" w:w="0"/>
-        <w:right w:type="dxa" w:w="108"/>
+        <w:top w:w="0" w:type="dxa"/>
+        <w:left w:w="108" w:type="dxa"/>
+        <w:bottom w:w="0" w:type="dxa"/>
+        <w:right w:w="108" w:type="dxa"/>
       </w:tblCellMar>
     </w:tblPr>
   </w:style>
-  <w:style w:default="1" w:styleId="a3" w:type="numbering">
+  <w:style w:type="numbering" w:default="1" w:styleId="NoList">
     <w:name w:val="No List"/>
     <w:uiPriority w:val="99"/>
     <w:semiHidden/>
     <w:unhideWhenUsed/>
   </w:style>
-  <w:style w:styleId="a0" w:type="paragraph">
+  <w:style w:type="paragraph" w:styleId="BodyText">
     <w:name w:val="Body Text"/>
-    <w:basedOn w:val="a"/>
+    <w:basedOn w:val="Normal"/>
     <w:qFormat/>
     <w:rsid w:val="00CF7597"/>
   </w:style>
-  <w:style w:customStyle="1" w:styleId="FirstParagraph" w:type="paragraph">
+  <w:style w:type="paragraph" w:customStyle="1" w:styleId="FirstParagraph">
     <w:name w:val="First Paragraph"/>
-    <w:basedOn w:val="a0"/>
-    <w:next w:val="a0"/>
+    <w:basedOn w:val="BodyText"/>
+    <w:next w:val="BodyText"/>
     <w:qFormat/>
   </w:style>
-  <w:style w:customStyle="1" w:styleId="Compact" w:type="paragraph">
+  <w:style w:type="paragraph" w:customStyle="1" w:styleId="Compact">
     <w:name w:val="Compact"/>
-    <w:basedOn w:val="a0"/>
+    <w:basedOn w:val="BodyText"/>
     <w:qFormat/>
     <w:pPr>
-      <w:spacing w:after="36" w:before="36"/>
-    </w:pPr>
-  </w:style>
-  <w:style w:styleId="a4" w:type="paragraph">
+      <w:spacing w:before="36" w:after="36"/>
+    </w:pPr>
+  </w:style>
+  <w:style w:type="paragraph" w:styleId="Title">
     <w:name w:val="Title"/>
-    <w:basedOn w:val="a"/>
-    <w:next w:val="a0"/>
-    <w:link w:val="a5"/>
+    <w:basedOn w:val="Normal"/>
+    <w:next w:val="BodyText"/>
+    <w:link w:val="TitleChar"/>
     <w:uiPriority w:val="10"/>
     <w:qFormat/>
     <w:rsid w:val="00AF517C"/>
@@ -2119,28 +2027,28 @@
       <w:jc w:val="center"/>
     </w:pPr>
     <w:rPr>
-      <w:rFonts w:cs="Times New Roman (标题 CS)" w:eastAsia="黑体"/>
+      <w:rFonts w:eastAsia="SimHei" w:cs="Times New Roman (标题 CS)"/>
       <w:sz w:val="30"/>
       <w:szCs w:val="56"/>
     </w:rPr>
   </w:style>
-  <w:style w:customStyle="1" w:styleId="a5" w:type="character">
-    <w:name w:val="标题 字符"/>
-    <w:basedOn w:val="a1"/>
-    <w:link w:val="a4"/>
+  <w:style w:type="character" w:customStyle="1" w:styleId="TitleChar">
+    <w:name w:val="Title Char"/>
+    <w:basedOn w:val="DefaultParagraphFont"/>
+    <w:link w:val="Title"/>
     <w:uiPriority w:val="10"/>
     <w:rsid w:val="00AF517C"/>
     <w:rPr>
-      <w:rFonts w:ascii="Arial" w:cs="Times New Roman (标题 CS)" w:eastAsia="黑体" w:hAnsi="Arial"/>
+      <w:rFonts w:ascii="Arial" w:eastAsia="SimHei" w:hAnsi="Arial" w:cs="Times New Roman (标题 CS)"/>
       <w:sz w:val="30"/>
       <w:szCs w:val="56"/>
     </w:rPr>
   </w:style>
-  <w:style w:styleId="a6" w:type="paragraph">
+  <w:style w:type="paragraph" w:styleId="Subtitle">
     <w:name w:val="Subtitle"/>
-    <w:basedOn w:val="a4"/>
-    <w:next w:val="a0"/>
-    <w:link w:val="a7"/>
+    <w:basedOn w:val="Title"/>
+    <w:next w:val="BodyText"/>
+    <w:link w:val="SubtitleChar"/>
     <w:uiPriority w:val="11"/>
     <w:qFormat/>
     <w:rsid w:val="00A10FD9"/>
@@ -2150,30 +2058,30 @@
       </w:numPr>
     </w:pPr>
     <w:rPr>
-      <w:rFonts w:cstheme="majorBidi" w:eastAsiaTheme="majorEastAsia"/>
+      <w:rFonts w:eastAsiaTheme="majorEastAsia" w:cstheme="majorBidi"/>
       <w:spacing w:val="15"/>
       <w:sz w:val="28"/>
       <w:szCs w:val="28"/>
     </w:rPr>
   </w:style>
-  <w:style w:customStyle="1" w:styleId="a7" w:type="character">
-    <w:name w:val="副标题 字符"/>
-    <w:basedOn w:val="a1"/>
-    <w:link w:val="a6"/>
+  <w:style w:type="character" w:customStyle="1" w:styleId="SubtitleChar">
+    <w:name w:val="Subtitle Char"/>
+    <w:basedOn w:val="DefaultParagraphFont"/>
+    <w:link w:val="Subtitle"/>
     <w:uiPriority w:val="11"/>
     <w:rsid w:val="00A10FD9"/>
     <w:rPr>
-      <w:rFonts w:cstheme="majorBidi" w:eastAsiaTheme="majorEastAsia"/>
-      <w:color w:themeColor="text1" w:themeTint="A6" w:val="595959"/>
+      <w:rFonts w:eastAsiaTheme="majorEastAsia" w:cstheme="majorBidi"/>
+      <w:color w:val="595959" w:themeColor="text1" w:themeTint="A6"/>
       <w:spacing w:val="15"/>
       <w:sz w:val="28"/>
       <w:szCs w:val="28"/>
     </w:rPr>
   </w:style>
-  <w:style w:customStyle="1" w:styleId="Author" w:type="paragraph">
+  <w:style w:type="paragraph" w:customStyle="1" w:styleId="Author">
     <w:name w:val="Author"/>
-    <w:basedOn w:val="a4"/>
-    <w:next w:val="a0"/>
+    <w:basedOn w:val="Title"/>
+    <w:next w:val="BodyText"/>
     <w:qFormat/>
     <w:pPr>
       <w:keepNext/>
@@ -2184,10 +2092,10 @@
       <w:szCs w:val="24"/>
     </w:rPr>
   </w:style>
-  <w:style w:styleId="a8" w:type="paragraph">
+  <w:style w:type="paragraph" w:styleId="Date">
     <w:name w:val="Date"/>
-    <w:basedOn w:val="a4"/>
-    <w:next w:val="a0"/>
+    <w:basedOn w:val="Title"/>
+    <w:next w:val="BodyText"/>
     <w:qFormat/>
     <w:pPr>
       <w:keepNext/>
@@ -2198,9 +2106,9 @@
       <w:szCs w:val="24"/>
     </w:rPr>
   </w:style>
-  <w:style w:customStyle="1" w:styleId="AbstractTitle" w:type="paragraph">
+  <w:style w:type="paragraph" w:customStyle="1" w:styleId="AbstractTitle">
     <w:name w:val="Abstract Title"/>
-    <w:basedOn w:val="a"/>
+    <w:basedOn w:val="Normal"/>
     <w:next w:val="Abstract"/>
     <w:qFormat/>
     <w:pPr>
@@ -2215,157 +2123,157 @@
       <w:szCs w:val="20"/>
     </w:rPr>
   </w:style>
-  <w:style w:customStyle="1" w:styleId="Abstract" w:type="paragraph">
+  <w:style w:type="paragraph" w:customStyle="1" w:styleId="Abstract">
     <w:name w:val="Abstract"/>
-    <w:basedOn w:val="a"/>
-    <w:next w:val="a0"/>
+    <w:basedOn w:val="Normal"/>
+    <w:next w:val="BodyText"/>
     <w:qFormat/>
     <w:pPr>
       <w:keepNext/>
       <w:keepLines/>
-      <w:spacing w:after="300" w:before="100"/>
+      <w:spacing w:before="100" w:after="300"/>
     </w:pPr>
     <w:rPr>
       <w:sz w:val="20"/>
       <w:szCs w:val="20"/>
     </w:rPr>
   </w:style>
-  <w:style w:styleId="a9" w:type="paragraph">
+  <w:style w:type="paragraph" w:styleId="Bibliography">
     <w:name w:val="Bibliography"/>
-    <w:basedOn w:val="a"/>
+    <w:basedOn w:val="Normal"/>
     <w:qFormat/>
   </w:style>
-  <w:style w:customStyle="1" w:styleId="10" w:type="character">
-    <w:name w:val="标题 1 字符"/>
-    <w:basedOn w:val="a1"/>
-    <w:link w:val="1"/>
+  <w:style w:type="character" w:customStyle="1" w:styleId="Heading1Char">
+    <w:name w:val="Heading 1 Char"/>
+    <w:basedOn w:val="DefaultParagraphFont"/>
+    <w:link w:val="Heading1"/>
     <w:uiPriority w:val="9"/>
     <w:rsid w:val="008708D9"/>
     <w:rPr>
-      <w:rFonts w:ascii="Arial" w:cs="Times New Roman (标题 CS)" w:eastAsia="黑体" w:hAnsi="Arial"/>
+      <w:rFonts w:ascii="Arial" w:eastAsia="SimHei" w:hAnsi="Arial" w:cs="Times New Roman (标题 CS)"/>
       <w:sz w:val="30"/>
       <w:szCs w:val="40"/>
     </w:rPr>
   </w:style>
-  <w:style w:customStyle="1" w:styleId="20" w:type="character">
-    <w:name w:val="标题 2 字符"/>
-    <w:basedOn w:val="a1"/>
-    <w:link w:val="2"/>
+  <w:style w:type="character" w:customStyle="1" w:styleId="Heading2Char">
+    <w:name w:val="Heading 2 Char"/>
+    <w:basedOn w:val="DefaultParagraphFont"/>
+    <w:link w:val="Heading2"/>
     <w:uiPriority w:val="9"/>
     <w:semiHidden/>
     <w:rsid w:val="008708D9"/>
     <w:rPr>
-      <w:rFonts w:ascii="Arial" w:cs="Times New Roman (标题 CS)" w:eastAsia="黑体" w:hAnsi="Arial"/>
+      <w:rFonts w:ascii="Arial" w:eastAsia="SimHei" w:hAnsi="Arial" w:cs="Times New Roman (标题 CS)"/>
       <w:sz w:val="28"/>
       <w:szCs w:val="32"/>
     </w:rPr>
   </w:style>
-  <w:style w:customStyle="1" w:styleId="30" w:type="character">
-    <w:name w:val="标题 3 字符"/>
-    <w:basedOn w:val="a1"/>
-    <w:link w:val="3"/>
+  <w:style w:type="character" w:customStyle="1" w:styleId="Heading3Char">
+    <w:name w:val="Heading 3 Char"/>
+    <w:basedOn w:val="DefaultParagraphFont"/>
+    <w:link w:val="Heading3"/>
     <w:uiPriority w:val="9"/>
     <w:semiHidden/>
     <w:rsid w:val="008708D9"/>
     <w:rPr>
-      <w:rFonts w:ascii="Arial" w:cs="Times New Roman (标题 CS)" w:eastAsia="黑体" w:hAnsi="Arial"/>
+      <w:rFonts w:ascii="Arial" w:eastAsia="SimHei" w:hAnsi="Arial" w:cs="Times New Roman (标题 CS)"/>
       <w:sz w:val="26"/>
       <w:szCs w:val="28"/>
     </w:rPr>
   </w:style>
-  <w:style w:customStyle="1" w:styleId="40" w:type="character">
-    <w:name w:val="标题 4 字符"/>
-    <w:basedOn w:val="a1"/>
-    <w:link w:val="4"/>
+  <w:style w:type="character" w:customStyle="1" w:styleId="Heading4Char">
+    <w:name w:val="Heading 4 Char"/>
+    <w:basedOn w:val="DefaultParagraphFont"/>
+    <w:link w:val="Heading4"/>
     <w:uiPriority w:val="9"/>
     <w:rsid w:val="00EC61BB"/>
     <w:rPr>
-      <w:rFonts w:ascii="Arial" w:cs="Times New Roman (标题 CS)" w:eastAsia="黑体" w:hAnsi="Arial"/>
-      <w:color w:themeColor="accent1" w:themeShade="BF" w:val="0F4761"/>
+      <w:rFonts w:ascii="Arial" w:eastAsia="SimHei" w:hAnsi="Arial" w:cs="Times New Roman (标题 CS)"/>
+      <w:color w:val="0F4761" w:themeColor="accent1" w:themeShade="BF"/>
       <w:sz w:val="26"/>
       <w:szCs w:val="28"/>
     </w:rPr>
   </w:style>
-  <w:style w:customStyle="1" w:styleId="50" w:type="character">
-    <w:name w:val="标题 5 字符"/>
-    <w:basedOn w:val="a1"/>
-    <w:link w:val="5"/>
+  <w:style w:type="character" w:customStyle="1" w:styleId="Heading5Char">
+    <w:name w:val="Heading 5 Char"/>
+    <w:basedOn w:val="DefaultParagraphFont"/>
+    <w:link w:val="Heading5"/>
     <w:uiPriority w:val="9"/>
     <w:rsid w:val="00EC61BB"/>
     <w:rPr>
-      <w:rFonts w:ascii="Arial" w:cs="Times New Roman (标题 CS)" w:eastAsia="黑体" w:hAnsi="Arial"/>
-      <w:color w:themeColor="accent1" w:themeShade="BF" w:val="0F4761"/>
+      <w:rFonts w:ascii="Arial" w:eastAsia="SimHei" w:hAnsi="Arial" w:cs="Times New Roman (标题 CS)"/>
+      <w:color w:val="0F4761" w:themeColor="accent1" w:themeShade="BF"/>
       <w:sz w:val="26"/>
       <w:szCs w:val="28"/>
     </w:rPr>
   </w:style>
-  <w:style w:customStyle="1" w:styleId="60" w:type="character">
-    <w:name w:val="标题 6 字符"/>
-    <w:basedOn w:val="a1"/>
-    <w:link w:val="6"/>
+  <w:style w:type="character" w:customStyle="1" w:styleId="Heading6Char">
+    <w:name w:val="Heading 6 Char"/>
+    <w:basedOn w:val="DefaultParagraphFont"/>
+    <w:link w:val="Heading6"/>
     <w:uiPriority w:val="9"/>
     <w:rsid w:val="00EC61BB"/>
     <w:rPr>
-      <w:rFonts w:ascii="Arial" w:cs="Times New Roman (标题 CS)" w:eastAsia="黑体" w:hAnsi="Arial"/>
-      <w:color w:themeColor="accent1" w:themeShade="BF" w:val="0F4761"/>
+      <w:rFonts w:ascii="Arial" w:eastAsia="SimHei" w:hAnsi="Arial" w:cs="Times New Roman (标题 CS)"/>
+      <w:color w:val="0F4761" w:themeColor="accent1" w:themeShade="BF"/>
       <w:sz w:val="26"/>
       <w:szCs w:val="28"/>
     </w:rPr>
   </w:style>
-  <w:style w:customStyle="1" w:styleId="70" w:type="character">
-    <w:name w:val="标题 7 字符"/>
-    <w:basedOn w:val="a1"/>
-    <w:link w:val="7"/>
+  <w:style w:type="character" w:customStyle="1" w:styleId="Heading7Char">
+    <w:name w:val="Heading 7 Char"/>
+    <w:basedOn w:val="DefaultParagraphFont"/>
+    <w:link w:val="Heading7"/>
     <w:uiPriority w:val="9"/>
     <w:rsid w:val="00EC61BB"/>
     <w:rPr>
-      <w:rFonts w:ascii="Arial" w:cs="Times New Roman (标题 CS)" w:eastAsia="黑体" w:hAnsi="Arial"/>
-      <w:color w:themeColor="accent1" w:themeShade="BF" w:val="0F4761"/>
+      <w:rFonts w:ascii="Arial" w:eastAsia="SimHei" w:hAnsi="Arial" w:cs="Times New Roman (标题 CS)"/>
+      <w:color w:val="0F4761" w:themeColor="accent1" w:themeShade="BF"/>
       <w:sz w:val="26"/>
       <w:szCs w:val="28"/>
     </w:rPr>
   </w:style>
-  <w:style w:customStyle="1" w:styleId="80" w:type="character">
-    <w:name w:val="标题 8 字符"/>
-    <w:basedOn w:val="a1"/>
-    <w:link w:val="8"/>
+  <w:style w:type="character" w:customStyle="1" w:styleId="Heading8Char">
+    <w:name w:val="Heading 8 Char"/>
+    <w:basedOn w:val="DefaultParagraphFont"/>
+    <w:link w:val="Heading8"/>
     <w:uiPriority w:val="9"/>
     <w:rsid w:val="00EC61BB"/>
     <w:rPr>
-      <w:rFonts w:ascii="Arial" w:cs="Times New Roman (标题 CS)" w:eastAsia="黑体" w:hAnsi="Arial"/>
-      <w:color w:themeColor="accent1" w:themeShade="BF" w:val="0F4761"/>
+      <w:rFonts w:ascii="Arial" w:eastAsia="SimHei" w:hAnsi="Arial" w:cs="Times New Roman (标题 CS)"/>
+      <w:color w:val="0F4761" w:themeColor="accent1" w:themeShade="BF"/>
       <w:sz w:val="26"/>
       <w:szCs w:val="28"/>
     </w:rPr>
   </w:style>
-  <w:style w:customStyle="1" w:styleId="90" w:type="character">
-    <w:name w:val="标题 9 字符"/>
-    <w:basedOn w:val="a1"/>
-    <w:link w:val="9"/>
+  <w:style w:type="character" w:customStyle="1" w:styleId="Heading9Char">
+    <w:name w:val="Heading 9 Char"/>
+    <w:basedOn w:val="DefaultParagraphFont"/>
+    <w:link w:val="Heading9"/>
     <w:uiPriority w:val="9"/>
     <w:rsid w:val="00EC61BB"/>
     <w:rPr>
-      <w:rFonts w:ascii="Arial" w:cs="Times New Roman (标题 CS)" w:eastAsia="黑体" w:hAnsi="Arial"/>
-      <w:color w:themeColor="accent1" w:themeShade="BF" w:val="0F4761"/>
+      <w:rFonts w:ascii="Arial" w:eastAsia="SimHei" w:hAnsi="Arial" w:cs="Times New Roman (标题 CS)"/>
+      <w:color w:val="0F4761" w:themeColor="accent1" w:themeShade="BF"/>
       <w:sz w:val="26"/>
       <w:szCs w:val="28"/>
     </w:rPr>
   </w:style>
-  <w:style w:styleId="aa" w:type="paragraph">
+  <w:style w:type="paragraph" w:styleId="BlockText">
     <w:name w:val="Block Text"/>
-    <w:basedOn w:val="a0"/>
-    <w:next w:val="a0"/>
+    <w:basedOn w:val="BodyText"/>
+    <w:next w:val="BodyText"/>
     <w:uiPriority w:val="9"/>
     <w:unhideWhenUsed/>
     <w:qFormat/>
     <w:pPr>
-      <w:spacing w:after="100" w:before="100"/>
+      <w:spacing w:before="100" w:after="100"/>
       <w:ind w:left="480" w:right="480"/>
     </w:pPr>
   </w:style>
-  <w:style w:styleId="ab" w:type="paragraph">
+  <w:style w:type="paragraph" w:styleId="FootnoteText">
     <w:name w:val="footnote text"/>
-    <w:basedOn w:val="a"/>
+    <w:basedOn w:val="Normal"/>
     <w:uiPriority w:val="9"/>
     <w:unhideWhenUsed/>
     <w:qFormat/>
@@ -2374,30 +2282,30 @@
       <w:sz w:val="18"/>
     </w:rPr>
   </w:style>
-  <w:style w:customStyle="1" w:styleId="FootnoteBlockText" w:type="paragraph">
+  <w:style w:type="paragraph" w:customStyle="1" w:styleId="FootnoteBlockText">
     <w:name w:val="Footnote Block Text"/>
-    <w:basedOn w:val="ab"/>
-    <w:next w:val="ab"/>
+    <w:basedOn w:val="FootnoteText"/>
+    <w:next w:val="FootnoteText"/>
     <w:uiPriority w:val="9"/>
     <w:unhideWhenUsed/>
     <w:qFormat/>
     <w:pPr>
-      <w:spacing w:after="100" w:before="100"/>
+      <w:spacing w:before="100" w:after="100"/>
       <w:ind w:left="480" w:right="480"/>
     </w:pPr>
   </w:style>
-  <w:style w:customStyle="1" w:styleId="Table" w:type="table">
+  <w:style w:type="table" w:customStyle="1" w:styleId="Table">
     <w:name w:val="Table"/>
     <w:semiHidden/>
     <w:unhideWhenUsed/>
     <w:qFormat/>
     <w:tblPr>
-      <w:tblInd w:type="dxa" w:w="0"/>
+      <w:tblInd w:w="0" w:type="dxa"/>
       <w:tblCellMar>
-        <w:top w:type="dxa" w:w="0"/>
-        <w:left w:type="dxa" w:w="108"/>
-        <w:bottom w:type="dxa" w:w="0"/>
-        <w:right w:type="dxa" w:w="108"/>
+        <w:top w:w="0" w:type="dxa"/>
+        <w:left w:w="108" w:type="dxa"/>
+        <w:bottom w:w="0" w:type="dxa"/>
+        <w:right w:w="108" w:type="dxa"/>
       </w:tblCellMar>
     </w:tblPr>
     <w:tblStylePr w:type="firstRow">
@@ -2409,15 +2317,15 @@
       </w:trPr>
       <w:tcPr>
         <w:tcBorders>
-          <w:bottom w:color="auto" w:space="0" w:sz="0" w:val="single"/>
+          <w:bottom w:val="single" w:sz="0" w:space="0" w:color="auto"/>
         </w:tcBorders>
         <w:vAlign w:val="bottom"/>
       </w:tcPr>
     </w:tblStylePr>
   </w:style>
-  <w:style w:customStyle="1" w:styleId="DefinitionTerm" w:type="paragraph">
+  <w:style w:type="paragraph" w:customStyle="1" w:styleId="DefinitionTerm">
     <w:name w:val="Definition Term"/>
-    <w:basedOn w:val="a"/>
+    <w:basedOn w:val="Normal"/>
     <w:next w:val="Definition"/>
     <w:pPr>
       <w:keepNext/>
@@ -2427,14 +2335,14 @@
       <w:b/>
     </w:rPr>
   </w:style>
-  <w:style w:customStyle="1" w:styleId="Definition" w:type="paragraph">
+  <w:style w:type="paragraph" w:customStyle="1" w:styleId="Definition">
     <w:name w:val="Definition"/>
-    <w:basedOn w:val="a"/>
-  </w:style>
-  <w:style w:styleId="ac" w:type="paragraph">
+    <w:basedOn w:val="Normal"/>
+  </w:style>
+  <w:style w:type="paragraph" w:styleId="Caption">
     <w:name w:val="caption"/>
-    <w:basedOn w:val="a"/>
-    <w:link w:val="ad"/>
+    <w:basedOn w:val="Normal"/>
+    <w:link w:val="CaptionChar"/>
     <w:pPr>
       <w:spacing w:after="120"/>
     </w:pPr>
@@ -2442,9 +2350,9 @@
       <w:i/>
     </w:rPr>
   </w:style>
-  <w:style w:customStyle="1" w:styleId="TableCaption" w:type="paragraph">
+  <w:style w:type="paragraph" w:customStyle="1" w:styleId="TableCaption">
     <w:name w:val="Table Caption"/>
-    <w:basedOn w:val="ac"/>
+    <w:basedOn w:val="Caption"/>
     <w:rsid w:val="00746C97"/>
     <w:pPr>
       <w:keepNext/>
@@ -2456,9 +2364,9 @@
       <w:sz w:val="20"/>
     </w:rPr>
   </w:style>
-  <w:style w:customStyle="1" w:styleId="ImageCaption" w:type="paragraph">
+  <w:style w:type="paragraph" w:customStyle="1" w:styleId="ImageCaption">
     <w:name w:val="Image Caption"/>
-    <w:basedOn w:val="ac"/>
+    <w:basedOn w:val="Caption"/>
     <w:rsid w:val="00BF08D0"/>
     <w:pPr>
       <w:spacing w:after="0"/>
@@ -2469,52 +2377,53 @@
       <w:sz w:val="20"/>
     </w:rPr>
   </w:style>
-  <w:style w:customStyle="1" w:styleId="Figure" w:type="paragraph">
+  <w:style w:type="paragraph" w:customStyle="1" w:styleId="Figure">
     <w:name w:val="Figure"/>
-    <w:basedOn w:val="a"/>
-  </w:style>
-  <w:style w:customStyle="1" w:styleId="CaptionedFigure" w:type="paragraph">
+    <w:basedOn w:val="Normal"/>
+  </w:style>
+  <w:style w:type="paragraph" w:customStyle="1" w:styleId="CaptionedFigure">
     <w:name w:val="Captioned Figure"/>
     <w:basedOn w:val="Figure"/>
     <w:pPr>
       <w:keepNext/>
     </w:pPr>
   </w:style>
-  <w:style w:customStyle="1" w:styleId="ad" w:type="character">
-    <w:name w:val="题注 字符"/>
-    <w:basedOn w:val="a1"/>
-    <w:link w:val="ac"/>
-  </w:style>
-  <w:style w:customStyle="1" w:styleId="VerbatimChar" w:type="character">
+  <w:style w:type="character" w:customStyle="1" w:styleId="CaptionChar">
+    <w:name w:val="Caption Char"/>
+    <w:basedOn w:val="DefaultParagraphFont"/>
+    <w:link w:val="Caption"/>
+  </w:style>
+  <w:style w:type="character" w:customStyle="1" w:styleId="VerbatimChar">
     <w:name w:val="Verbatim Char"/>
-    <w:basedOn w:val="ad"/>
+    <w:basedOn w:val="CaptionChar"/>
+    <w:link w:val="SourceCode"/>
     <w:rPr>
       <w:rFonts w:ascii="Consolas" w:hAnsi="Consolas"/>
       <w:sz w:val="22"/>
     </w:rPr>
   </w:style>
-  <w:style w:customStyle="1" w:styleId="SectionNumber" w:type="character">
+  <w:style w:type="character" w:customStyle="1" w:styleId="SectionNumber">
     <w:name w:val="Section Number"/>
-    <w:basedOn w:val="ad"/>
-  </w:style>
-  <w:style w:styleId="ae" w:type="character">
+    <w:basedOn w:val="CaptionChar"/>
+  </w:style>
+  <w:style w:type="character" w:styleId="FootnoteReference">
     <w:name w:val="footnote reference"/>
-    <w:basedOn w:val="ad"/>
+    <w:basedOn w:val="CaptionChar"/>
     <w:rPr>
       <w:vertAlign w:val="superscript"/>
     </w:rPr>
   </w:style>
-  <w:style w:styleId="af" w:type="character">
+  <w:style w:type="character" w:styleId="Hyperlink">
     <w:name w:val="Hyperlink"/>
-    <w:basedOn w:val="ad"/>
-    <w:rPr>
-      <w:color w:themeColor="accent1" w:val="156082"/>
-    </w:rPr>
-  </w:style>
-  <w:style w:styleId="TOC" w:type="paragraph">
+    <w:basedOn w:val="CaptionChar"/>
+    <w:rPr>
+      <w:color w:val="156082" w:themeColor="accent1"/>
+    </w:rPr>
+  </w:style>
+  <w:style w:type="paragraph" w:styleId="TOCHeading">
     <w:name w:val="TOC Heading"/>
-    <w:basedOn w:val="1"/>
-    <w:next w:val="a0"/>
+    <w:basedOn w:val="Heading1"/>
+    <w:next w:val="BodyText"/>
     <w:uiPriority w:val="39"/>
     <w:unhideWhenUsed/>
     <w:qFormat/>
@@ -2523,44 +2432,44 @@
       <w:outlineLvl w:val="9"/>
     </w:pPr>
     <w:rPr>
-      <w:rFonts w:asciiTheme="majorHAnsi" w:cstheme="majorBidi" w:eastAsiaTheme="majorEastAsia" w:hAnsiTheme="majorHAnsi"/>
-    </w:rPr>
-  </w:style>
-  <w:style w:styleId="af0" w:type="table">
+      <w:rFonts w:asciiTheme="majorHAnsi" w:eastAsiaTheme="majorEastAsia" w:hAnsiTheme="majorHAnsi" w:cstheme="majorBidi"/>
+    </w:rPr>
+  </w:style>
+  <w:style w:type="table" w:styleId="TableGrid">
     <w:name w:val="Table Grid"/>
-    <w:basedOn w:val="a2"/>
+    <w:basedOn w:val="TableNormal"/>
     <w:rsid w:val="00746C97"/>
     <w:pPr>
       <w:spacing w:after="0"/>
     </w:pPr>
     <w:tblPr>
       <w:tblBorders>
-        <w:top w:color="auto" w:space="0" w:sz="4" w:val="single"/>
-        <w:left w:color="auto" w:space="0" w:sz="4" w:val="single"/>
-        <w:bottom w:color="auto" w:space="0" w:sz="4" w:val="single"/>
-        <w:right w:color="auto" w:space="0" w:sz="4" w:val="single"/>
-        <w:insideH w:color="auto" w:space="0" w:sz="4" w:val="single"/>
-        <w:insideV w:color="auto" w:space="0" w:sz="4" w:val="single"/>
+        <w:top w:val="single" w:sz="4" w:space="0" w:color="auto"/>
+        <w:left w:val="single" w:sz="4" w:space="0" w:color="auto"/>
+        <w:bottom w:val="single" w:sz="4" w:space="0" w:color="auto"/>
+        <w:right w:val="single" w:sz="4" w:space="0" w:color="auto"/>
+        <w:insideH w:val="single" w:sz="4" w:space="0" w:color="auto"/>
+        <w:insideV w:val="single" w:sz="4" w:space="0" w:color="auto"/>
       </w:tblBorders>
     </w:tblPr>
   </w:style>
-  <w:style w:styleId="af1" w:type="paragraph">
+  <w:style w:type="paragraph" w:styleId="ListParagraph">
     <w:name w:val="List Paragraph"/>
-    <w:basedOn w:val="a0"/>
+    <w:basedOn w:val="BodyText"/>
     <w:rsid w:val="0051628A"/>
     <w:pPr>
-      <w:ind w:firstLine="420" w:firstLineChars="200"/>
-    </w:pPr>
-  </w:style>
-  <w:style w:styleId="af2" w:type="paragraph">
+      <w:ind w:firstLineChars="200" w:firstLine="420"/>
+    </w:pPr>
+  </w:style>
+  <w:style w:type="paragraph" w:styleId="Header">
     <w:name w:val="header"/>
-    <w:basedOn w:val="a"/>
-    <w:link w:val="af3"/>
+    <w:basedOn w:val="Normal"/>
+    <w:link w:val="HeaderChar"/>
     <w:rsid w:val="005F6CBF"/>
     <w:pPr>
       <w:tabs>
-        <w:tab w:pos="4153" w:val="center"/>
-        <w:tab w:pos="8306" w:val="right"/>
+        <w:tab w:val="center" w:pos="4153"/>
+        <w:tab w:val="right" w:pos="8306"/>
       </w:tabs>
       <w:snapToGrid w:val="0"/>
       <w:spacing w:line="240" w:lineRule="auto"/>
@@ -2571,26 +2480,26 @@
       <w:szCs w:val="18"/>
     </w:rPr>
   </w:style>
-  <w:style w:customStyle="1" w:styleId="af3" w:type="character">
-    <w:name w:val="页眉 字符"/>
-    <w:basedOn w:val="a1"/>
-    <w:link w:val="af2"/>
+  <w:style w:type="character" w:customStyle="1" w:styleId="HeaderChar">
+    <w:name w:val="Header Char"/>
+    <w:basedOn w:val="DefaultParagraphFont"/>
+    <w:link w:val="Header"/>
     <w:rsid w:val="005F6CBF"/>
     <w:rPr>
-      <w:rFonts w:ascii="Arial" w:cs="Times New Roman (正文 CS 字体)" w:eastAsia="宋体" w:hAnsi="Arial"/>
+      <w:rFonts w:ascii="Arial" w:eastAsia="SimSun" w:hAnsi="Arial" w:cs="Times New Roman (正文 CS 字体)"/>
       <w:sz w:val="18"/>
       <w:szCs w:val="18"/>
     </w:rPr>
   </w:style>
-  <w:style w:styleId="af4" w:type="paragraph">
+  <w:style w:type="paragraph" w:styleId="Footer">
     <w:name w:val="footer"/>
-    <w:basedOn w:val="a"/>
-    <w:link w:val="af5"/>
+    <w:basedOn w:val="Normal"/>
+    <w:link w:val="FooterChar"/>
     <w:rsid w:val="005F6CBF"/>
     <w:pPr>
       <w:tabs>
-        <w:tab w:pos="4153" w:val="center"/>
-        <w:tab w:pos="8306" w:val="right"/>
+        <w:tab w:val="center" w:pos="4153"/>
+        <w:tab w:val="right" w:pos="8306"/>
       </w:tabs>
       <w:snapToGrid w:val="0"/>
       <w:spacing w:line="240" w:lineRule="auto"/>
@@ -2600,250 +2509,314 @@
       <w:szCs w:val="18"/>
     </w:rPr>
   </w:style>
-  <w:style w:customStyle="1" w:styleId="af5" w:type="character">
-    <w:name w:val="页脚 字符"/>
-    <w:basedOn w:val="a1"/>
-    <w:link w:val="af4"/>
+  <w:style w:type="character" w:customStyle="1" w:styleId="FooterChar">
+    <w:name w:val="Footer Char"/>
+    <w:basedOn w:val="DefaultParagraphFont"/>
+    <w:link w:val="Footer"/>
     <w:rsid w:val="005F6CBF"/>
     <w:rPr>
-      <w:rFonts w:ascii="Arial" w:cs="Times New Roman (正文 CS 字体)" w:eastAsia="宋体" w:hAnsi="Arial"/>
+      <w:rFonts w:ascii="Arial" w:eastAsia="SimSun" w:hAnsi="Arial" w:cs="Times New Roman (正文 CS 字体)"/>
       <w:sz w:val="18"/>
       <w:szCs w:val="18"/>
     </w:rPr>
   </w:style>
   <w:style w:type="paragraph" w:customStyle="1" w:styleId="SourceCode">
     <w:name w:val="Source Code"/>
-    <w:basedOn w:val="Normal"/>
     <w:link w:val="VerbatimChar"/>
     <w:pPr>
-      <w:wordWrap w:val="off"/>
+      <w:wordWrap w:val="0"/>
     </w:pPr>
   </w:style>
   <w:style w:type="character" w:customStyle="1" w:styleId="KeywordTok">
     <w:name w:val="KeywordTok"/>
     <w:basedOn w:val="VerbatimChar"/>
     <w:rPr>
+      <w:rFonts w:ascii="Consolas" w:hAnsi="Consolas"/>
       <w:b/>
       <w:color w:val="007020"/>
+      <w:sz w:val="22"/>
     </w:rPr>
   </w:style>
   <w:style w:type="character" w:customStyle="1" w:styleId="DataTypeTok">
     <w:name w:val="DataTypeTok"/>
     <w:basedOn w:val="VerbatimChar"/>
     <w:rPr>
+      <w:rFonts w:ascii="Consolas" w:hAnsi="Consolas"/>
       <w:color w:val="902000"/>
+      <w:sz w:val="22"/>
     </w:rPr>
   </w:style>
   <w:style w:type="character" w:customStyle="1" w:styleId="DecValTok">
     <w:name w:val="DecValTok"/>
     <w:basedOn w:val="VerbatimChar"/>
     <w:rPr>
-      <w:color w:val="40a070"/>
+      <w:rFonts w:ascii="Consolas" w:hAnsi="Consolas"/>
+      <w:color w:val="40A070"/>
+      <w:sz w:val="22"/>
     </w:rPr>
   </w:style>
   <w:style w:type="character" w:customStyle="1" w:styleId="BaseNTok">
     <w:name w:val="BaseNTok"/>
     <w:basedOn w:val="VerbatimChar"/>
     <w:rPr>
-      <w:color w:val="40a070"/>
+      <w:rFonts w:ascii="Consolas" w:hAnsi="Consolas"/>
+      <w:color w:val="40A070"/>
+      <w:sz w:val="22"/>
     </w:rPr>
   </w:style>
   <w:style w:type="character" w:customStyle="1" w:styleId="FloatTok">
     <w:name w:val="FloatTok"/>
     <w:basedOn w:val="VerbatimChar"/>
     <w:rPr>
-      <w:color w:val="40a070"/>
+      <w:rFonts w:ascii="Consolas" w:hAnsi="Consolas"/>
+      <w:color w:val="40A070"/>
+      <w:sz w:val="22"/>
     </w:rPr>
   </w:style>
   <w:style w:type="character" w:customStyle="1" w:styleId="ConstantTok">
     <w:name w:val="ConstantTok"/>
     <w:basedOn w:val="VerbatimChar"/>
     <w:rPr>
+      <w:rFonts w:ascii="Consolas" w:hAnsi="Consolas"/>
       <w:color w:val="880000"/>
+      <w:sz w:val="22"/>
     </w:rPr>
   </w:style>
   <w:style w:type="character" w:customStyle="1" w:styleId="CharTok">
     <w:name w:val="CharTok"/>
     <w:basedOn w:val="VerbatimChar"/>
     <w:rPr>
-      <w:color w:val="4070a0"/>
+      <w:rFonts w:ascii="Consolas" w:hAnsi="Consolas"/>
+      <w:color w:val="4070A0"/>
+      <w:sz w:val="22"/>
     </w:rPr>
   </w:style>
   <w:style w:type="character" w:customStyle="1" w:styleId="SpecialCharTok">
     <w:name w:val="SpecialCharTok"/>
     <w:basedOn w:val="VerbatimChar"/>
     <w:rPr>
-      <w:color w:val="4070a0"/>
+      <w:rFonts w:ascii="Consolas" w:hAnsi="Consolas"/>
+      <w:color w:val="4070A0"/>
+      <w:sz w:val="22"/>
     </w:rPr>
   </w:style>
   <w:style w:type="character" w:customStyle="1" w:styleId="StringTok">
     <w:name w:val="StringTok"/>
     <w:basedOn w:val="VerbatimChar"/>
     <w:rPr>
-      <w:color w:val="4070a0"/>
+      <w:rFonts w:ascii="Consolas" w:hAnsi="Consolas"/>
+      <w:color w:val="4070A0"/>
+      <w:sz w:val="22"/>
     </w:rPr>
   </w:style>
   <w:style w:type="character" w:customStyle="1" w:styleId="VerbatimStringTok">
     <w:name w:val="VerbatimStringTok"/>
     <w:basedOn w:val="VerbatimChar"/>
     <w:rPr>
-      <w:color w:val="4070a0"/>
+      <w:rFonts w:ascii="Consolas" w:hAnsi="Consolas"/>
+      <w:color w:val="4070A0"/>
+      <w:sz w:val="22"/>
     </w:rPr>
   </w:style>
   <w:style w:type="character" w:customStyle="1" w:styleId="SpecialStringTok">
     <w:name w:val="SpecialStringTok"/>
     <w:basedOn w:val="VerbatimChar"/>
     <w:rPr>
-      <w:color w:val="bb6688"/>
+      <w:rFonts w:ascii="Consolas" w:hAnsi="Consolas"/>
+      <w:color w:val="BB6688"/>
+      <w:sz w:val="22"/>
     </w:rPr>
   </w:style>
   <w:style w:type="character" w:customStyle="1" w:styleId="ImportTok">
     <w:name w:val="ImportTok"/>
     <w:basedOn w:val="VerbatimChar"/>
     <w:rPr>
+      <w:rFonts w:ascii="Consolas" w:hAnsi="Consolas"/>
       <w:b/>
       <w:color w:val="008000"/>
+      <w:sz w:val="22"/>
     </w:rPr>
   </w:style>
   <w:style w:type="character" w:customStyle="1" w:styleId="CommentTok">
     <w:name w:val="CommentTok"/>
     <w:basedOn w:val="VerbatimChar"/>
     <w:rPr>
+      <w:rFonts w:ascii="Consolas" w:hAnsi="Consolas"/>
       <w:i/>
-      <w:color w:val="60a0b0"/>
+      <w:color w:val="60A0B0"/>
+      <w:sz w:val="22"/>
     </w:rPr>
   </w:style>
   <w:style w:type="character" w:customStyle="1" w:styleId="DocumentationTok">
     <w:name w:val="DocumentationTok"/>
     <w:basedOn w:val="VerbatimChar"/>
     <w:rPr>
+      <w:rFonts w:ascii="Consolas" w:hAnsi="Consolas"/>
       <w:i/>
-      <w:color w:val="ba2121"/>
+      <w:color w:val="BA2121"/>
+      <w:sz w:val="22"/>
     </w:rPr>
   </w:style>
   <w:style w:type="character" w:customStyle="1" w:styleId="AnnotationTok">
     <w:name w:val="AnnotationTok"/>
     <w:basedOn w:val="VerbatimChar"/>
     <w:rPr>
+      <w:rFonts w:ascii="Consolas" w:hAnsi="Consolas"/>
       <w:b/>
       <w:i/>
-      <w:color w:val="60a0b0"/>
+      <w:color w:val="60A0B0"/>
+      <w:sz w:val="22"/>
     </w:rPr>
   </w:style>
   <w:style w:type="character" w:customStyle="1" w:styleId="CommentVarTok">
     <w:name w:val="CommentVarTok"/>
     <w:basedOn w:val="VerbatimChar"/>
     <w:rPr>
+      <w:rFonts w:ascii="Consolas" w:hAnsi="Consolas"/>
       <w:b/>
       <w:i/>
-      <w:color w:val="60a0b0"/>
+      <w:color w:val="60A0B0"/>
+      <w:sz w:val="22"/>
     </w:rPr>
   </w:style>
   <w:style w:type="character" w:customStyle="1" w:styleId="OtherTok">
     <w:name w:val="OtherTok"/>
     <w:basedOn w:val="VerbatimChar"/>
     <w:rPr>
+      <w:rFonts w:ascii="Consolas" w:hAnsi="Consolas"/>
       <w:color w:val="007020"/>
+      <w:sz w:val="22"/>
     </w:rPr>
   </w:style>
   <w:style w:type="character" w:customStyle="1" w:styleId="FunctionTok">
     <w:name w:val="FunctionTok"/>
     <w:basedOn w:val="VerbatimChar"/>
     <w:rPr>
-      <w:color w:val="06287e"/>
+      <w:rFonts w:ascii="Consolas" w:hAnsi="Consolas"/>
+      <w:color w:val="06287E"/>
+      <w:sz w:val="22"/>
     </w:rPr>
   </w:style>
   <w:style w:type="character" w:customStyle="1" w:styleId="VariableTok">
     <w:name w:val="VariableTok"/>
     <w:basedOn w:val="VerbatimChar"/>
     <w:rPr>
-      <w:color w:val="19177c"/>
+      <w:rFonts w:ascii="Consolas" w:hAnsi="Consolas"/>
+      <w:color w:val="19177C"/>
+      <w:sz w:val="22"/>
     </w:rPr>
   </w:style>
   <w:style w:type="character" w:customStyle="1" w:styleId="ControlFlowTok">
     <w:name w:val="ControlFlowTok"/>
     <w:basedOn w:val="VerbatimChar"/>
     <w:rPr>
+      <w:rFonts w:ascii="Consolas" w:hAnsi="Consolas"/>
       <w:b/>
       <w:color w:val="007020"/>
+      <w:sz w:val="22"/>
     </w:rPr>
   </w:style>
   <w:style w:type="character" w:customStyle="1" w:styleId="OperatorTok">
     <w:name w:val="OperatorTok"/>
     <w:basedOn w:val="VerbatimChar"/>
     <w:rPr>
+      <w:rFonts w:ascii="Consolas" w:hAnsi="Consolas"/>
       <w:color w:val="666666"/>
+      <w:sz w:val="22"/>
     </w:rPr>
   </w:style>
   <w:style w:type="character" w:customStyle="1" w:styleId="BuiltInTok">
     <w:name w:val="BuiltInTok"/>
     <w:basedOn w:val="VerbatimChar"/>
     <w:rPr>
+      <w:rFonts w:ascii="Consolas" w:hAnsi="Consolas"/>
       <w:color w:val="008000"/>
+      <w:sz w:val="22"/>
     </w:rPr>
   </w:style>
   <w:style w:type="character" w:customStyle="1" w:styleId="ExtensionTok">
     <w:name w:val="ExtensionTok"/>
     <w:basedOn w:val="VerbatimChar"/>
-    <w:rPr/>
+    <w:rPr>
+      <w:rFonts w:ascii="Consolas" w:hAnsi="Consolas"/>
+      <w:sz w:val="22"/>
+    </w:rPr>
   </w:style>
   <w:style w:type="character" w:customStyle="1" w:styleId="PreprocessorTok">
     <w:name w:val="PreprocessorTok"/>
     <w:basedOn w:val="VerbatimChar"/>
     <w:rPr>
-      <w:color w:val="bc7a00"/>
+      <w:rFonts w:ascii="Consolas" w:hAnsi="Consolas"/>
+      <w:color w:val="BC7A00"/>
+      <w:sz w:val="22"/>
     </w:rPr>
   </w:style>
   <w:style w:type="character" w:customStyle="1" w:styleId="AttributeTok">
     <w:name w:val="AttributeTok"/>
     <w:basedOn w:val="VerbatimChar"/>
     <w:rPr>
-      <w:color w:val="7d9029"/>
+      <w:rFonts w:ascii="Consolas" w:hAnsi="Consolas"/>
+      <w:color w:val="7D9029"/>
+      <w:sz w:val="22"/>
     </w:rPr>
   </w:style>
   <w:style w:type="character" w:customStyle="1" w:styleId="RegionMarkerTok">
     <w:name w:val="RegionMarkerTok"/>
     <w:basedOn w:val="VerbatimChar"/>
-    <w:rPr/>
+    <w:rPr>
+      <w:rFonts w:ascii="Consolas" w:hAnsi="Consolas"/>
+      <w:sz w:val="22"/>
+    </w:rPr>
   </w:style>
   <w:style w:type="character" w:customStyle="1" w:styleId="InformationTok">
     <w:name w:val="InformationTok"/>
     <w:basedOn w:val="VerbatimChar"/>
     <w:rPr>
+      <w:rFonts w:ascii="Consolas" w:hAnsi="Consolas"/>
       <w:b/>
       <w:i/>
-      <w:color w:val="60a0b0"/>
+      <w:color w:val="60A0B0"/>
+      <w:sz w:val="22"/>
     </w:rPr>
   </w:style>
   <w:style w:type="character" w:customStyle="1" w:styleId="WarningTok">
     <w:name w:val="WarningTok"/>
     <w:basedOn w:val="VerbatimChar"/>
     <w:rPr>
+      <w:rFonts w:ascii="Consolas" w:hAnsi="Consolas"/>
       <w:b/>
       <w:i/>
-      <w:color w:val="60a0b0"/>
+      <w:color w:val="60A0B0"/>
+      <w:sz w:val="22"/>
     </w:rPr>
   </w:style>
   <w:style w:type="character" w:customStyle="1" w:styleId="AlertTok">
     <w:name w:val="AlertTok"/>
     <w:basedOn w:val="VerbatimChar"/>
     <w:rPr>
+      <w:rFonts w:ascii="Consolas" w:hAnsi="Consolas"/>
       <w:b/>
-      <w:color w:val="ff0000"/>
+      <w:color w:val="FF0000"/>
+      <w:sz w:val="22"/>
     </w:rPr>
   </w:style>
   <w:style w:type="character" w:customStyle="1" w:styleId="ErrorTok">
     <w:name w:val="ErrorTok"/>
     <w:basedOn w:val="VerbatimChar"/>
     <w:rPr>
+      <w:rFonts w:ascii="Consolas" w:hAnsi="Consolas"/>
       <w:b/>
-      <w:color w:val="ff0000"/>
+      <w:color w:val="FF0000"/>
+      <w:sz w:val="22"/>
     </w:rPr>
   </w:style>
   <w:style w:type="character" w:customStyle="1" w:styleId="NormalTok">
     <w:name w:val="NormalTok"/>
     <w:basedOn w:val="VerbatimChar"/>
-    <w:rPr/>
+    <w:rPr>
+      <w:rFonts w:ascii="Consolas" w:hAnsi="Consolas"/>
+      <w:sz w:val="22"/>
+    </w:rPr>
   </w:style>
 </w:styles>
 </file>

</xml_diff>